<commit_message>
Rebrand inspections app colors and embed photos/sketch in technical DOCX
Switch the accent color from generic Tailwind blue to a graphite/charcoal
brand palette matching the TMS-HYDRA logo. Also add automatic embedding of
inspection photos and the roof sketch into the generated technical-solution
document, and rebuild that DOCX template via Word COM automation after
discovering the previous Python/ElementTree-built version was silently
corrupted (Word refused to open it and dropped several portfolio images on
forced repair).

Co-Authored-By: Claude Sonnet 5 <noreply@anthropic.com>
</commit_message>
<xml_diff>
--- a/inspections/templates/navrh-technickeho-riesenia.docx
+++ b/inspections/templates/navrh-technickeho-riesenia.docx
@@ -1,8 +1,8 @@
 
 <file path=word/document.xml><?xml version="1.0" encoding="utf-8"?>
-<w:document xmlns:ns1="http://schemas.openxmlformats.org/markup-compatibility/2006" xmlns:ns2="http://schemas.microsoft.com/office/word/2010/wordml" xmlns:ns3="http://schemas.openxmlformats.org/drawingml/2006/wordprocessingDrawing" xmlns:ns4="http://schemas.microsoft.com/office/word/2010/wordprocessingDrawing" xmlns:ns5="http://schemas.openxmlformats.org/drawingml/2006/main" xmlns:ns6="http://schemas.openxmlformats.org/drawingml/2006/picture" xmlns:ns7="http://schemas.openxmlformats.org/officeDocument/2006/relationships" xmlns:ns8="http://schemas.microsoft.com/office/drawing/2010/main" xmlns:w="http://schemas.openxmlformats.org/wordprocessingml/2006/main" ns1:Ignorable="w14 w15 w16se w16cid w16 w16cex w16sdtdh w16sdtfl w16du wp14">
+<w:document xmlns:wpc="http://schemas.microsoft.com/office/word/2010/wordprocessingCanvas" xmlns:cx="http://schemas.microsoft.com/office/drawing/2014/chartex" xmlns:cx1="http://schemas.microsoft.com/office/drawing/2015/9/8/chartex" xmlns:cx2="http://schemas.microsoft.com/office/drawing/2015/10/21/chartex" xmlns:cx3="http://schemas.microsoft.com/office/drawing/2016/5/9/chartex" xmlns:cx4="http://schemas.microsoft.com/office/drawing/2016/5/10/chartex" xmlns:cx5="http://schemas.microsoft.com/office/drawing/2016/5/11/chartex" xmlns:cx6="http://schemas.microsoft.com/office/drawing/2016/5/12/chartex" xmlns:cx7="http://schemas.microsoft.com/office/drawing/2016/5/13/chartex" xmlns:cx8="http://schemas.microsoft.com/office/drawing/2016/5/14/chartex" xmlns:mc="http://schemas.openxmlformats.org/markup-compatibility/2006" xmlns:aink="http://schemas.microsoft.com/office/drawing/2016/ink" xmlns:am3d="http://schemas.microsoft.com/office/drawing/2017/model3d" xmlns:o="urn:schemas-microsoft-com:office:office" xmlns:oel="http://schemas.microsoft.com/office/2019/extlst" xmlns:r="http://schemas.openxmlformats.org/officeDocument/2006/relationships" xmlns:m="http://schemas.openxmlformats.org/officeDocument/2006/math" xmlns:v="urn:schemas-microsoft-com:vml" xmlns:wp14="http://schemas.microsoft.com/office/word/2010/wordprocessingDrawing" xmlns:wp="http://schemas.openxmlformats.org/drawingml/2006/wordprocessingDrawing" xmlns:w10="urn:schemas-microsoft-com:office:word" xmlns:w="http://schemas.openxmlformats.org/wordprocessingml/2006/main" xmlns:w14="http://schemas.microsoft.com/office/word/2010/wordml" xmlns:w15="http://schemas.microsoft.com/office/word/2012/wordml" xmlns:w16cex="http://schemas.microsoft.com/office/word/2018/wordml/cex" xmlns:w16cid="http://schemas.microsoft.com/office/word/2016/wordml/cid" xmlns:w16="http://schemas.microsoft.com/office/word/2018/wordml" xmlns:w16du="http://schemas.microsoft.com/office/word/2023/wordml/word16du" xmlns:w16sdtdh="http://schemas.microsoft.com/office/word/2020/wordml/sdtdatahash" xmlns:w16sdtfl="http://schemas.microsoft.com/office/word/2024/wordml/sdtformatlock" xmlns:w16se="http://schemas.microsoft.com/office/word/2015/wordml/symex" xmlns:wpg="http://schemas.microsoft.com/office/word/2010/wordprocessingGroup" xmlns:wpi="http://schemas.microsoft.com/office/word/2010/wordprocessingInk" xmlns:wne="http://schemas.microsoft.com/office/word/2006/wordml" xmlns:wps="http://schemas.microsoft.com/office/word/2010/wordprocessingShape" mc:Ignorable="w14 w15 w16se w16cid w16 w16cex w16sdtdh w16sdtfl w16du wp14">
   <w:body>
-    <w:p ns2:paraId="3FAC8DAF" ns2:textId="77777777">
+    <w:p>
       <w:pPr>
         <w:pStyle w:val="Nzov"/>
         <w:jc w:val="center"/>
@@ -20,9 +20,8 @@
           <w:iCs/>
           <w:color w:val="000000" w:themeColor="text1"/>
         </w:rPr>
-        <w:t xml:space="preserve">TMS-Hydra </w:t>
-      </w:r>
-      <w:proofErr w:type="spellStart"/>
+        <w:t>TMS-Hydra</w:t>
+      </w:r>
       <w:r>
         <w:rPr>
           <w:rStyle w:val="Vrazn"/>
@@ -30,20 +29,10 @@
           <w:iCs/>
           <w:color w:val="000000" w:themeColor="text1"/>
         </w:rPr>
-        <w:t>s.r.o</w:t>
-      </w:r>
-      <w:proofErr w:type="spellEnd"/>
-      <w:r>
-        <w:rPr>
-          <w:rStyle w:val="Vrazn"/>
-          <w:i/>
-          <w:iCs/>
-          <w:color w:val="000000" w:themeColor="text1"/>
-        </w:rPr>
-        <w:t>.</w:t>
-      </w:r>
-    </w:p>
-    <w:p ns2:paraId="59C4546E" ns2:textId="77777777">
+        <w:t xml:space="preserve"> s.r.o.</w:t>
+      </w:r>
+    </w:p>
+    <w:p>
       <w:pPr>
         <w:jc w:val="center"/>
         <w:rPr>
@@ -65,7 +54,7 @@
         <w:t xml:space="preserve">Špecialisti pre ploché strechy </w:t>
       </w:r>
     </w:p>
-    <w:p ns2:paraId="5BE7E257" ns2:textId="77777777">
+    <w:p>
       <w:pPr>
         <w:jc w:val="center"/>
         <w:rPr>
@@ -88,7 +77,7 @@
         <w:t>Palárikovo Krížna 3073/79 - 941 11</w:t>
       </w:r>
     </w:p>
-    <w:p ns2:paraId="69E31066" ns2:textId="77777777">
+    <w:p>
       <w:pPr>
         <w:jc w:val="center"/>
         <w:rPr>
@@ -98,7 +87,7 @@
         </w:rPr>
       </w:pPr>
     </w:p>
-    <w:p ns2:paraId="3CFE8221" ns2:textId="77777777">
+    <w:p>
       <w:pPr>
         <w:rPr>
           <w:b/>
@@ -107,7 +96,7 @@
         </w:rPr>
       </w:pPr>
     </w:p>
-    <w:p ns2:paraId="0AD2EF21" ns2:textId="55A6627B">
+    <w:p>
       <w:pPr>
         <w:jc w:val="center"/>
         <w:rPr>
@@ -122,10 +111,10 @@
           <w:color w:val="000000" w:themeColor="text1"/>
           <w:sz w:val="36"/>
         </w:rPr>
-        <w:t xml:space="preserve">Návrh technického riešenia pre rekonštrukciu plochej strechy na rodinnom dome na adrese {pracovisko}.</w:t>
-      </w:r>
-    </w:p>
-    <w:p ns2:paraId="18A64F75" ns2:textId="77777777">
+        <w:t>Návrh technického riešenia pre rekonštrukciu plochej strechy na rodinnom dome na adrese {pracovisko}.</w:t>
+      </w:r>
+    </w:p>
+    <w:p>
       <w:pPr>
         <w:rPr>
           <w:b/>
@@ -134,7 +123,7 @@
         </w:rPr>
       </w:pPr>
     </w:p>
-    <w:p ns2:paraId="3F430B4E" ns2:textId="77777777">
+    <w:p>
       <w:pPr>
         <w:jc w:val="center"/>
         <w:rPr>
@@ -144,7 +133,7 @@
         </w:rPr>
       </w:pPr>
     </w:p>
-    <w:p ns2:paraId="0A1573F9" ns2:textId="206F4DCA">
+    <w:p>
       <w:pPr>
         <w:jc w:val="center"/>
         <w:rPr>
@@ -159,28 +148,28 @@
           <w:color w:val="000000" w:themeColor="text1"/>
           <w:sz w:val="36"/>
         </w:rPr>
-        <w:t xml:space="preserve">Objednávateľ : {zakaznik_meno}</w:t>
-      </w:r>
-      <w:proofErr w:type="spellStart"/>
-      <w:r>
+        <w:t>Objednávateľ : {zakaznik_meno}</w:t>
+      </w:r>
+    </w:p>
+    <w:p>
+      <w:pPr>
+        <w:jc w:val="center"/>
         <w:rPr>
           <w:b/>
           <w:color w:val="000000" w:themeColor="text1"/>
           <w:sz w:val="36"/>
         </w:rPr>
-        <w:t/>
-      </w:r>
-      <w:proofErr w:type="spellEnd"/>
+      </w:pPr>
       <w:r>
         <w:rPr>
           <w:b/>
           <w:color w:val="000000" w:themeColor="text1"/>
           <w:sz w:val="36"/>
         </w:rPr>
-        <w:t xml:space="preserve"/>
-      </w:r>
-    </w:p>
-    <w:p ns2:paraId="740ED99E" ns2:textId="0E7D48FB">
+        <w:t>Kontakt : {zakaznik_telefon}</w:t>
+      </w:r>
+    </w:p>
+    <w:p>
       <w:pPr>
         <w:jc w:val="center"/>
         <w:rPr>
@@ -195,28 +184,10 @@
           <w:color w:val="000000" w:themeColor="text1"/>
           <w:sz w:val="36"/>
         </w:rPr>
-        <w:t xml:space="preserve">Kontakt : {zakaznik_telefon}</w:t>
-      </w:r>
-    </w:p>
-    <w:p ns2:paraId="78BF6B25" ns2:textId="4F201E52">
-      <w:pPr>
-        <w:jc w:val="center"/>
-        <w:rPr>
-          <w:b/>
-          <w:color w:val="000000" w:themeColor="text1"/>
-          <w:sz w:val="36"/>
-        </w:rPr>
-      </w:pPr>
-      <w:r>
-        <w:rPr>
-          <w:b/>
-          <w:color w:val="000000" w:themeColor="text1"/>
-          <w:sz w:val="36"/>
-        </w:rPr>
-        <w:t xml:space="preserve">Adresa : {zakaznik_adresa}</w:t>
-      </w:r>
-    </w:p>
-    <w:p ns2:paraId="38A9AC49" ns2:textId="77777777">
+        <w:t>Adresa : {zakaznik_adresa}</w:t>
+      </w:r>
+    </w:p>
+    <w:p>
       <w:pPr>
         <w:jc w:val="center"/>
         <w:rPr>
@@ -226,7 +197,7 @@
         </w:rPr>
       </w:pPr>
     </w:p>
-    <w:p ns2:paraId="6BB2F68F" ns2:textId="77777777">
+    <w:p>
       <w:pPr>
         <w:jc w:val="center"/>
         <w:rPr>
@@ -236,7 +207,7 @@
         </w:rPr>
       </w:pPr>
     </w:p>
-    <w:p ns2:paraId="627E683F" ns2:textId="2BEDA182">
+    <w:p>
       <w:pPr>
         <w:jc w:val="center"/>
         <w:rPr>
@@ -252,7 +223,7 @@
         <w:t>Alternatíva</w:t>
       </w:r>
     </w:p>
-    <w:p ns2:paraId="267211D4" ns2:textId="075AEE21">
+    <w:p>
       <w:pPr>
         <w:jc w:val="center"/>
         <w:rPr>
@@ -265,10 +236,10 @@
           <w:b/>
           <w:sz w:val="36"/>
         </w:rPr>
-        <w:t xml:space="preserve">({alternativa_label}){alternativa_popis}</w:t>
-      </w:r>
-    </w:p>
-    <w:p ns2:paraId="01D28144" ns2:textId="77777777">
+        <w:t>({alternativa_label}){alternativa_popis}</w:t>
+      </w:r>
+    </w:p>
+    <w:p>
       <w:pPr>
         <w:jc w:val="center"/>
         <w:rPr>
@@ -277,7 +248,7 @@
         </w:rPr>
       </w:pPr>
     </w:p>
-    <w:p ns2:paraId="2CB19C3A" ns2:textId="77777777">
+    <w:p>
       <w:pPr>
         <w:jc w:val="center"/>
         <w:rPr>
@@ -294,49 +265,49 @@
           <w:sz w:val="36"/>
         </w:rPr>
         <w:drawing>
-          <ns3:inline distT="0" distB="0" distL="0" distR="0" ns4:anchorId="34C326CD" ns4:editId="3DB461A0">
-            <ns3:extent cx="2186369" cy="1775460"/>
-            <ns3:effectExtent l="0" t="0" r="4445" b="0"/>
-            <ns3:docPr id="471563147" name="Obrázok 2" descr="Obrázok, na ktorom je text, písmo, logo, symbol&#10;&#10;Obsah vygenerovaný pomocou AI môže byť nesprávny."/>
-            <ns3:cNvGraphicFramePr>
-              <ns5:graphicFrameLocks noChangeAspect="1"/>
-            </ns3:cNvGraphicFramePr>
-            <ns5:graphic>
-              <ns5:graphicData uri="http://schemas.openxmlformats.org/drawingml/2006/picture">
-                <ns6:pic>
-                  <ns6:nvPicPr>
-                    <ns6:cNvPr id="471563147" name="Obrázok 2" descr="Obrázok, na ktorom je text, písmo, logo, symbol&#10;&#10;Obsah vygenerovaný pomocou AI môže byť nesprávny."/>
-                    <ns6:cNvPicPr/>
-                  </ns6:nvPicPr>
-                  <ns6:blipFill>
-                    <ns5:blip ns7:embed="rId8" cstate="print">
-                      <ns5:extLst>
-                        <ns5:ext uri="{28A0092B-C50C-407E-A947-70E740481C1C}">
-                          <ns8:useLocalDpi val="0"/>
-                        </ns5:ext>
-                      </ns5:extLst>
-                    </ns5:blip>
-                    <ns5:stretch>
-                      <ns5:fillRect/>
-                    </ns5:stretch>
-                  </ns6:blipFill>
-                  <ns6:spPr>
-                    <ns5:xfrm>
-                      <ns5:off x="0" y="0"/>
-                      <ns5:ext cx="2209269" cy="1794056"/>
-                    </ns5:xfrm>
-                    <ns5:prstGeom prst="rect">
-                      <ns5:avLst/>
-                    </ns5:prstGeom>
-                  </ns6:spPr>
-                </ns6:pic>
-              </ns5:graphicData>
-            </ns5:graphic>
-          </ns3:inline>
+          <wp:inline distT="0" distB="0" distL="0" distR="0" wp14:anchorId="34C326CD" wp14:editId="3DB461A0">
+            <wp:extent cx="2186369" cy="1775460"/>
+            <wp:effectExtent l="0" t="0" r="4445" b="0"/>
+            <wp:docPr id="471563147" name="Obrázok 2" descr="Obrázok, na ktorom je text, písmo, logo, symbol&#10;&#10;Obsah vygenerovaný pomocou AI môže byť nesprávny."/>
+            <wp:cNvGraphicFramePr>
+              <a:graphicFrameLocks xmlns:a="http://schemas.openxmlformats.org/drawingml/2006/main" noChangeAspect="1"/>
+            </wp:cNvGraphicFramePr>
+            <a:graphic xmlns:a="http://schemas.openxmlformats.org/drawingml/2006/main">
+              <a:graphicData uri="http://schemas.openxmlformats.org/drawingml/2006/picture">
+                <pic:pic xmlns:pic="http://schemas.openxmlformats.org/drawingml/2006/picture">
+                  <pic:nvPicPr>
+                    <pic:cNvPr id="471563147" name="Obrázok 2" descr="Obrázok, na ktorom je text, písmo, logo, symbol&#10;&#10;Obsah vygenerovaný pomocou AI môže byť nesprávny."/>
+                    <pic:cNvPicPr/>
+                  </pic:nvPicPr>
+                  <pic:blipFill>
+                    <a:blip r:embed="rId8" cstate="print">
+                      <a:extLst>
+                        <a:ext uri="{28A0092B-C50C-407E-A947-70E740481C1C}">
+                          <a14:useLocalDpi xmlns:a14="http://schemas.microsoft.com/office/drawing/2010/main" val="0"/>
+                        </a:ext>
+                      </a:extLst>
+                    </a:blip>
+                    <a:stretch>
+                      <a:fillRect/>
+                    </a:stretch>
+                  </pic:blipFill>
+                  <pic:spPr>
+                    <a:xfrm>
+                      <a:off x="0" y="0"/>
+                      <a:ext cx="2209269" cy="1794056"/>
+                    </a:xfrm>
+                    <a:prstGeom prst="rect">
+                      <a:avLst/>
+                    </a:prstGeom>
+                  </pic:spPr>
+                </pic:pic>
+              </a:graphicData>
+            </a:graphic>
+          </wp:inline>
         </w:drawing>
       </w:r>
     </w:p>
-    <w:p ns2:paraId="331A21A5" ns2:textId="4750E440">
+    <w:p>
       <w:pPr>
         <w:jc w:val="center"/>
         <w:rPr>
@@ -353,18 +324,30 @@
         <w:t>Vitajte vo svete TMS-HYDRA. Moje meno je Tomáš Solnoky a som zakladateľom tejto spoločnosti. Za každým projektom, každou hydroizoláciou a každým zateplením plochej strechy stojí nielen naša odbornosť, ale aj hlboký osobný príbeh a záväzok. Príbeh o rodine, budúcnosti a tej najvyššej kvalite, ktorú si zaslúžite.</w:t>
       </w:r>
     </w:p>
-    <w:p ns2:paraId="0C89743C" ns2:textId="0B6A718C">
-      <w:pPr>
-        <w:jc w:val="center"/>
-        <w:rPr>
-          <w:sz w:val="24"/>
-        </w:rPr>
-      </w:pPr>
-      <w:r>
-        <w:rPr>
-          <w:sz w:val="24"/>
-        </w:rPr>
-        <w:t xml:space="preserve">Moja cesta k profesionálnym strechám začala v zahraničí pred viac ako desiatimi rokmi v Belgicku. Nebola to cesta skratiek – začínal som priamo na streche, s horákom, hydroizoláciou a tepelnými izoláciami v rukách. Belgicko ma naučilo precíznosti, európskym štandardom a tomu, že pri hydroizolácii neexistujú kompromisy – buď je to urobené dokonale, alebo to nefunguje.</w:t>
+    <w:p>
+      <w:pPr>
+        <w:jc w:val="center"/>
+        <w:rPr>
+          <w:sz w:val="24"/>
+        </w:rPr>
+      </w:pPr>
+      <w:r>
+        <w:rPr>
+          <w:sz w:val="24"/>
+        </w:rPr>
+        <w:t xml:space="preserve">Moja cesta k profesionálnym strechám začala </w:t>
+      </w:r>
+      <w:r>
+        <w:rPr>
+          <w:sz w:val="24"/>
+        </w:rPr>
+        <w:t xml:space="preserve">v zahraničí </w:t>
+      </w:r>
+      <w:r>
+        <w:rPr>
+          <w:sz w:val="24"/>
+        </w:rPr>
+        <w:t>pred viac ako desiatimi rokmi v Belgicku. Nebola to cesta skratiek – začínal som priamo na streche, s horákom, hydroizoláciou a tepelnými izoláciami v rukách. Belgicko ma naučilo precíznosti, európskym štandardom a tomu, že pri hydroizolácii neexistujú kompromisy – buď je to urobené dokonale, alebo to nefunguje.</w:t>
       </w:r>
       <w:r>
         <w:rPr>
@@ -374,7 +357,7 @@
         <w:t>V TMS-HYDRA nespájame len vrstvy izolácie, spájame odborné skúsenosti s poctivým prístupom k našim zákazníkom. Dovoľte nám postarať sa o vašu strechu s rovnakou precíznosťou, akú vyžadujeme sami od seba.</w:t>
       </w:r>
     </w:p>
-    <w:p ns2:paraId="103CEB9B" ns2:textId="77777777">
+    <w:p>
       <w:pPr>
         <w:jc w:val="center"/>
         <w:rPr>
@@ -388,7 +371,7 @@
         <w:t>Už od malička som vedel, že chcem chrániť. Chrániť to najdôležitejšie – domovy, v ktorých žijeme, miesta, kde pracujeme a kde sa cítime bezpečne. Svoje skúsenosti som pretavil do práce s plochými strechami, pretože strecha je srdcom každého domu. Je to štít, ktorý nás chráni pred nepriazňou počasia, drží teplo v zime a poskytuje útočisko.</w:t>
       </w:r>
     </w:p>
-    <w:p ns2:paraId="0C274991" ns2:textId="77777777">
+    <w:p>
       <w:pPr>
         <w:jc w:val="center"/>
         <w:rPr>
@@ -402,35 +385,21 @@
         <w:t>​Keď som zakladal túto firmu, chcel som, aby niesla odkaz, ktorý presahuje bežné podnikanie. Chcel som, aby bola odrazom mojich najväčších hodnôt. A tak sa zrodilo TMS-HYDRA.</w:t>
       </w:r>
     </w:p>
-    <w:p ns2:paraId="5A3DF240" ns2:textId="77777777">
-      <w:pPr>
-        <w:jc w:val="center"/>
-        <w:rPr>
-          <w:sz w:val="24"/>
-        </w:rPr>
-      </w:pPr>
-      <w:r>
-        <w:rPr>
-          <w:sz w:val="24"/>
-        </w:rPr>
-        <w:t>​Tie tri písmená – T.M.S. – majú pre mňa obrovský význam. Sú to iniciály mojich dvoch synov: Tomáš a </w:t>
-      </w:r>
-      <w:proofErr w:type="spellStart"/>
-      <w:r>
-        <w:rPr>
-          <w:sz w:val="24"/>
-        </w:rPr>
-        <w:t>Matias</w:t>
-      </w:r>
-      <w:proofErr w:type="spellEnd"/>
-      <w:r>
-        <w:rPr>
-          <w:sz w:val="24"/>
-        </w:rPr>
-        <w:t>. A samozrejme, moje Solnoky. Toto logo nie je len značka, je to symbol našej budúcnosti, nášho záväzku, ktorú pre nich budujem.</w:t>
-      </w:r>
-    </w:p>
-    <w:p ns2:paraId="15837265" ns2:textId="77777777">
+    <w:p>
+      <w:pPr>
+        <w:jc w:val="center"/>
+        <w:rPr>
+          <w:sz w:val="24"/>
+        </w:rPr>
+      </w:pPr>
+      <w:r>
+        <w:rPr>
+          <w:sz w:val="24"/>
+        </w:rPr>
+        <w:t>​Tie tri písmená – T.M.S. – majú pre mňa obrovský význam. Sú to iniciály mojich dvoch synov: Tomáš a Matias. A samozrejme, moje Solnoky. Toto logo nie je len značka, je to symbol našej budúcnosti, nášho záväzku, ktorú pre nich budujem.</w:t>
+      </w:r>
+    </w:p>
+    <w:p>
       <w:pPr>
         <w:jc w:val="center"/>
         <w:rPr>
@@ -444,7 +413,7 @@
         <w:t>​Prečo HYDRA? Pretože naša práca je o krotení vody. HYDRA evokuje silu, odolnosť a schopnosť chrániť pred vlhkosťou, ktorá môže narušiť štruktúru každej budovy. Je to o vytvorení nepriepustného štítu, ktorý vydrží roky.</w:t>
       </w:r>
     </w:p>
-    <w:p ns2:paraId="6EC84ACE" ns2:textId="77777777">
+    <w:p>
       <w:pPr>
         <w:jc w:val="center"/>
         <w:rPr>
@@ -458,49 +427,103 @@
         <w:t>Pre mňa a moju rodinu je každá strecha, ktorú realizujeme, akoby bola naša vlastná. Viem, aká dôležitá je ochrana, spoľahlivosť a dlhá životnosť. Preto kladieme dôraz na najmodernejšie technológie, najkvalitnejšie materiály a precíznosť v každom detaile. Každý člen nášho tímu zdieľa túto vášeň a odhodlanie.</w:t>
       </w:r>
     </w:p>
-    <w:p ns2:paraId="14EAB0EE" ns2:textId="53AAD06B">
-      <w:pPr>
-        <w:jc w:val="center"/>
-        <w:rPr>
-          <w:sz w:val="24"/>
-        </w:rPr>
-      </w:pPr>
-      <w:r>
-        <w:rPr>
-          <w:sz w:val="24"/>
-        </w:rPr>
-        <w:t xml:space="preserve">Zahraničná prax ma naučila techniku, rodina ma naučila zodpovednosti. Pre mňa je každá strecha, ktorú realizujeme, akoby bola naša vlastná. Viem, aká dôležitá je ochrana a spoľahlivosť, preto do každého projektu vkladáme tie najvyššie štandardy, ktoré som si osvojil počas rokov v zahraničí.</w:t>
-      </w:r>
-    </w:p>
-    <w:p ns2:paraId="3B51E266" ns2:textId="1BB1382A">
-      <w:pPr>
-        <w:jc w:val="center"/>
-        <w:rPr>
-          <w:sz w:val="24"/>
-        </w:rPr>
-      </w:pPr>
-      <w:r>
-        <w:rPr>
-          <w:sz w:val="24"/>
-        </w:rPr>
-        <w:t xml:space="preserve">Keď si vyberiete TMS-HYDRA, nevyberiete si len dodávateľa. Vyberiete si partnera, ktorý berie svoju prácu osobne, s rodinnou zodpovednosťou a s víziou odolnej a trvácnej budúcnosti. Pretože rovnako ako chránim svoju rodinu, chceme chrániť aj tú vašu </w:t>
-      </w:r>
-    </w:p>
-    <w:p ns2:paraId="0A926A1D" ns2:textId="21C16E1F">
-      <w:pPr>
-        <w:jc w:val="center"/>
-        <w:rPr>
-          <w:sz w:val="24"/>
-        </w:rPr>
-      </w:pPr>
-      <w:r>
-        <w:rPr>
-          <w:sz w:val="24"/>
-        </w:rPr>
-        <w:t xml:space="preserve">– pevnými a spoľahlivými strechami –</w:t>
-      </w:r>
-    </w:p>
-    <w:p ns2:paraId="7A3DA01F" ns2:textId="20AE0DAB">
+    <w:p>
+      <w:pPr>
+        <w:jc w:val="center"/>
+        <w:rPr>
+          <w:sz w:val="24"/>
+        </w:rPr>
+      </w:pPr>
+      <w:r>
+        <w:rPr>
+          <w:sz w:val="24"/>
+        </w:rPr>
+        <w:t>Zahraničná prax ma naučila techniku, rodina ma naučila zodpovednosti. Pre mňa je každá strecha, ktorú realizujeme, akoby bola naša vlastná. Viem, aká dôležitá je ochrana a spoľahlivosť, preto do každého projektu vkladáme tie najvyššie štandardy, ktoré s</w:t>
+      </w:r>
+      <w:r>
+        <w:rPr>
+          <w:sz w:val="24"/>
+        </w:rPr>
+        <w:t>om</w:t>
+      </w:r>
+      <w:r>
+        <w:rPr>
+          <w:sz w:val="24"/>
+        </w:rPr>
+        <w:t xml:space="preserve"> si osvojil počas rokov v zahraničí.</w:t>
+      </w:r>
+    </w:p>
+    <w:p>
+      <w:pPr>
+        <w:jc w:val="center"/>
+        <w:rPr>
+          <w:sz w:val="24"/>
+        </w:rPr>
+      </w:pPr>
+      <w:r>
+        <w:rPr>
+          <w:sz w:val="24"/>
+        </w:rPr>
+        <w:t>Keď si vyberiete TMS-HYDRA, nevyber</w:t>
+      </w:r>
+      <w:r>
+        <w:rPr>
+          <w:sz w:val="24"/>
+        </w:rPr>
+        <w:t>ie</w:t>
+      </w:r>
+      <w:r>
+        <w:rPr>
+          <w:sz w:val="24"/>
+        </w:rPr>
+        <w:t>te si len dodávateľa. Vyber</w:t>
+      </w:r>
+      <w:r>
+        <w:rPr>
+          <w:sz w:val="24"/>
+        </w:rPr>
+        <w:t xml:space="preserve">iete </w:t>
+      </w:r>
+      <w:r>
+        <w:rPr>
+          <w:sz w:val="24"/>
+        </w:rPr>
+        <w:t>si partnera, ktorý berie svoju prácu osobne, s rodinnou zodpovednosťou a s víziou odolnej a trvácnej budúcnosti. Pretože rovnako ako chránim svoju rodinu, chceme chrániť aj tú vašu</w:t>
+      </w:r>
+      <w:r>
+        <w:rPr>
+          <w:sz w:val="24"/>
+        </w:rPr>
+        <w:t xml:space="preserve"> </w:t>
+      </w:r>
+    </w:p>
+    <w:p>
+      <w:pPr>
+        <w:jc w:val="center"/>
+        <w:rPr>
+          <w:sz w:val="24"/>
+        </w:rPr>
+      </w:pPr>
+      <w:r>
+        <w:rPr>
+          <w:sz w:val="24"/>
+        </w:rPr>
+        <w:t>– pevnými a spoľahlivými strechami</w:t>
+      </w:r>
+      <w:r>
+        <w:rPr>
+          <w:sz w:val="24"/>
+        </w:rPr>
+        <w:t xml:space="preserve"> </w:t>
+      </w:r>
+      <w:r>
+        <w:rPr>
+          <w:sz w:val="24"/>
+        </w:rPr>
+        <w:t>–</w:t>
+      </w:r>
+    </w:p>
+    <w:p>
       <w:pPr>
         <w:jc w:val="center"/>
         <w:rPr>
@@ -513,7 +536,7 @@
         </w:rPr>
       </w:pPr>
     </w:p>
-    <w:p ns2:paraId="4359343D" ns2:textId="504F2B8B">
+    <w:p>
       <w:pPr>
         <w:rPr>
           <w:b/>
@@ -532,63 +555,63 @@
           <w:sz w:val="36"/>
         </w:rPr>
         <w:drawing>
-          <ns3:anchor distT="0" distB="0" distL="114300" distR="114300" simplePos="0" relativeHeight="251731968" behindDoc="0" locked="0" layoutInCell="1" allowOverlap="1" ns4:anchorId="791D479C" ns4:editId="28B3D4AA">
-            <ns3:simplePos x="0" y="0"/>
-            <ns3:positionH relativeFrom="margin">
-              <ns3:align>right</ns3:align>
-            </ns3:positionH>
-            <ns3:positionV relativeFrom="bottomMargin">
-              <ns3:align>top</ns3:align>
-            </ns3:positionV>
-            <ns3:extent cx="1023620" cy="829945"/>
-            <ns3:effectExtent l="0" t="0" r="5080" b="8255"/>
-            <ns3:wrapSquare wrapText="bothSides"/>
-            <ns3:docPr id="260017531" name="Obrázok 2" descr="Obrázok, na ktorom je text, písmo, logo, symbol&#10;&#10;Obsah vygenerovaný pomocou AI môže byť nesprávny."/>
-            <ns3:cNvGraphicFramePr>
-              <ns5:graphicFrameLocks noChangeAspect="1"/>
-            </ns3:cNvGraphicFramePr>
-            <ns5:graphic>
-              <ns5:graphicData uri="http://schemas.openxmlformats.org/drawingml/2006/picture">
-                <ns6:pic>
-                  <ns6:nvPicPr>
-                    <ns6:cNvPr id="471563147" name="Obrázok 2" descr="Obrázok, na ktorom je text, písmo, logo, symbol&#10;&#10;Obsah vygenerovaný pomocou AI môže byť nesprávny."/>
-                    <ns6:cNvPicPr/>
-                  </ns6:nvPicPr>
-                  <ns6:blipFill>
-                    <ns5:blip ns7:embed="rId9" cstate="print">
-                      <ns5:extLst>
-                        <ns5:ext uri="{28A0092B-C50C-407E-A947-70E740481C1C}">
-                          <ns8:useLocalDpi val="0"/>
-                        </ns5:ext>
-                      </ns5:extLst>
-                    </ns5:blip>
-                    <ns5:stretch>
-                      <ns5:fillRect/>
-                    </ns5:stretch>
-                  </ns6:blipFill>
-                  <ns6:spPr>
-                    <ns5:xfrm>
-                      <ns5:off x="0" y="0"/>
-                      <ns5:ext cx="1023620" cy="829945"/>
-                    </ns5:xfrm>
-                    <ns5:prstGeom prst="rect">
-                      <ns5:avLst/>
-                    </ns5:prstGeom>
-                  </ns6:spPr>
-                </ns6:pic>
-              </ns5:graphicData>
-            </ns5:graphic>
-            <ns4:sizeRelH relativeFrom="margin">
-              <ns4:pctWidth>0</ns4:pctWidth>
-            </ns4:sizeRelH>
-            <ns4:sizeRelV relativeFrom="margin">
-              <ns4:pctHeight>0</ns4:pctHeight>
-            </ns4:sizeRelV>
-          </ns3:anchor>
+          <wp:anchor distT="0" distB="0" distL="114300" distR="114300" simplePos="0" relativeHeight="251731968" behindDoc="0" locked="0" layoutInCell="1" allowOverlap="1" wp14:anchorId="791D479C" wp14:editId="28B3D4AA">
+            <wp:simplePos x="0" y="0"/>
+            <wp:positionH relativeFrom="margin">
+              <wp:align>right</wp:align>
+            </wp:positionH>
+            <wp:positionV relativeFrom="bottomMargin">
+              <wp:align>top</wp:align>
+            </wp:positionV>
+            <wp:extent cx="1023620" cy="829945"/>
+            <wp:effectExtent l="0" t="0" r="5080" b="8255"/>
+            <wp:wrapSquare wrapText="bothSides"/>
+            <wp:docPr id="260017531" name="Obrázok 2" descr="Obrázok, na ktorom je text, písmo, logo, symbol&#10;&#10;Obsah vygenerovaný pomocou AI môže byť nesprávny."/>
+            <wp:cNvGraphicFramePr>
+              <a:graphicFrameLocks xmlns:a="http://schemas.openxmlformats.org/drawingml/2006/main" noChangeAspect="1"/>
+            </wp:cNvGraphicFramePr>
+            <a:graphic xmlns:a="http://schemas.openxmlformats.org/drawingml/2006/main">
+              <a:graphicData uri="http://schemas.openxmlformats.org/drawingml/2006/picture">
+                <pic:pic xmlns:pic="http://schemas.openxmlformats.org/drawingml/2006/picture">
+                  <pic:nvPicPr>
+                    <pic:cNvPr id="471563147" name="Obrázok 2" descr="Obrázok, na ktorom je text, písmo, logo, symbol&#10;&#10;Obsah vygenerovaný pomocou AI môže byť nesprávny."/>
+                    <pic:cNvPicPr/>
+                  </pic:nvPicPr>
+                  <pic:blipFill>
+                    <a:blip r:embed="rId9" cstate="print">
+                      <a:extLst>
+                        <a:ext uri="{28A0092B-C50C-407E-A947-70E740481C1C}">
+                          <a14:useLocalDpi xmlns:a14="http://schemas.microsoft.com/office/drawing/2010/main" val="0"/>
+                        </a:ext>
+                      </a:extLst>
+                    </a:blip>
+                    <a:stretch>
+                      <a:fillRect/>
+                    </a:stretch>
+                  </pic:blipFill>
+                  <pic:spPr>
+                    <a:xfrm>
+                      <a:off x="0" y="0"/>
+                      <a:ext cx="1023620" cy="829945"/>
+                    </a:xfrm>
+                    <a:prstGeom prst="rect">
+                      <a:avLst/>
+                    </a:prstGeom>
+                  </pic:spPr>
+                </pic:pic>
+              </a:graphicData>
+            </a:graphic>
+            <wp14:sizeRelH relativeFrom="margin">
+              <wp14:pctWidth>0</wp14:pctWidth>
+            </wp14:sizeRelH>
+            <wp14:sizeRelV relativeFrom="margin">
+              <wp14:pctHeight>0</wp14:pctHeight>
+            </wp14:sizeRelV>
+          </wp:anchor>
         </w:drawing>
       </w:r>
     </w:p>
-    <w:p ns2:paraId="081CC6BC" ns2:textId="0AB576A9">
+    <w:p>
       <w:pPr>
         <w:jc w:val="center"/>
         <w:rPr>
@@ -609,10 +632,11 @@
           <w:highlight w:val="yellow"/>
           <w:u w:val="single"/>
         </w:rPr>
+        <w:lastRenderedPageBreak/>
         <w:t xml:space="preserve">Súčasný stav strešného plášťa </w:t>
       </w:r>
     </w:p>
-    <w:p ns2:paraId="637538FC" ns2:textId="71F5BA0C">
+    <w:p>
       <w:pPr>
         <w:pStyle w:val="Odsekzoznamu"/>
         <w:ind w:left="1440"/>
@@ -628,10 +652,10 @@
           <w:color w:val="000000" w:themeColor="text1"/>
           <w:sz w:val="24"/>
         </w:rPr>
-        <w:t xml:space="preserve">{sucasny_stav}</w:t>
-      </w:r>
-    </w:p>
-    <w:p ns2:paraId="591B04D4" ns2:textId="77777777">
+        <w:t>{sucasny_stav}</w:t>
+      </w:r>
+    </w:p>
+    <w:p>
       <w:pPr>
         <w:jc w:val="center"/>
         <w:rPr>
@@ -642,8 +666,96 @@
           <w:u w:val="single"/>
         </w:rPr>
       </w:pPr>
-    </w:p>
-    <w:p ns2:paraId="455450E2" ns2:textId="290B90FC">
+      <w:r>
+        <w:rPr>
+          <w:b/>
+          <w:color w:val="000000" w:themeColor="text1"/>
+          <w:sz w:val="32"/>
+          <w:szCs w:val="28"/>
+          <w:u w:val="single"/>
+        </w:rPr>
+        <w:t>{#fotky}</w:t>
+      </w:r>
+    </w:p>
+    <w:p>
+      <w:pPr>
+        <w:jc w:val="center"/>
+        <w:rPr>
+          <w:b/>
+          <w:color w:val="000000" w:themeColor="text1"/>
+          <w:szCs w:val="28"/>
+          <w:u w:val="single"/>
+        </w:rPr>
+      </w:pPr>
+      <w:r>
+        <w:rPr>
+          <w:b/>
+          <w:color w:val="000000" w:themeColor="text1"/>
+          <w:szCs w:val="28"/>
+          <w:u w:val="single"/>
+        </w:rPr>
+        <w:t>{%foto}</w:t>
+      </w:r>
+    </w:p>
+    <w:p>
+      <w:pPr>
+        <w:jc w:val="center"/>
+        <w:rPr>
+          <w:b/>
+          <w:i/>
+          <w:color w:val="000000" w:themeColor="text1"/>
+          <w:sz w:val="20"/>
+          <w:szCs w:val="28"/>
+          <w:u w:val="single"/>
+        </w:rPr>
+      </w:pPr>
+      <w:r>
+        <w:rPr>
+          <w:b/>
+          <w:i/>
+          <w:color w:val="000000" w:themeColor="text1"/>
+          <w:sz w:val="20"/>
+          <w:szCs w:val="28"/>
+          <w:u w:val="single"/>
+        </w:rPr>
+        <w:t>{caption}</w:t>
+      </w:r>
+    </w:p>
+    <w:p>
+      <w:pPr>
+        <w:jc w:val="center"/>
+        <w:rPr>
+          <w:b/>
+          <w:color w:val="000000" w:themeColor="text1"/>
+          <w:sz w:val="32"/>
+          <w:szCs w:val="28"/>
+          <w:u w:val="single"/>
+        </w:rPr>
+      </w:pPr>
+      <w:r>
+        <w:rPr>
+          <w:b/>
+          <w:color w:val="000000" w:themeColor="text1"/>
+          <w:sz w:val="32"/>
+          <w:szCs w:val="28"/>
+          <w:u w:val="single"/>
+        </w:rPr>
+        <w:t>{/fotky}</w:t>
+      </w:r>
+    </w:p>
+    <w:p>
+      <w:pPr>
+        <w:jc w:val="center"/>
+        <w:rPr>
+          <w:b/>
+          <w:color w:val="000000" w:themeColor="text1"/>
+          <w:sz w:val="32"/>
+          <w:szCs w:val="28"/>
+          <w:u w:val="single"/>
+        </w:rPr>
+      </w:pPr>
+    </w:p>
+    <w:p>
       <w:pPr>
         <w:rPr>
           <w:b/>
@@ -662,63 +774,63 @@
           <w:sz w:val="36"/>
         </w:rPr>
         <w:drawing>
-          <ns3:anchor distT="0" distB="0" distL="114300" distR="114300" simplePos="0" relativeHeight="251734016" behindDoc="0" locked="0" layoutInCell="1" allowOverlap="1" ns4:anchorId="11AF0A76" ns4:editId="34DCA072">
-            <ns3:simplePos x="0" y="0"/>
-            <ns3:positionH relativeFrom="margin">
-              <ns3:align>right</ns3:align>
-            </ns3:positionH>
-            <ns3:positionV relativeFrom="bottomMargin">
-              <ns3:align>top</ns3:align>
-            </ns3:positionV>
-            <ns3:extent cx="1023620" cy="829945"/>
-            <ns3:effectExtent l="0" t="0" r="5080" b="8255"/>
-            <ns3:wrapSquare wrapText="bothSides"/>
-            <ns3:docPr id="1312645695" name="Obrázok 2" descr="Obrázok, na ktorom je text, písmo, logo, symbol&#10;&#10;Obsah vygenerovaný pomocou AI môže byť nesprávny."/>
-            <ns3:cNvGraphicFramePr>
-              <ns5:graphicFrameLocks noChangeAspect="1"/>
-            </ns3:cNvGraphicFramePr>
-            <ns5:graphic>
-              <ns5:graphicData uri="http://schemas.openxmlformats.org/drawingml/2006/picture">
-                <ns6:pic>
-                  <ns6:nvPicPr>
-                    <ns6:cNvPr id="471563147" name="Obrázok 2" descr="Obrázok, na ktorom je text, písmo, logo, symbol&#10;&#10;Obsah vygenerovaný pomocou AI môže byť nesprávny."/>
-                    <ns6:cNvPicPr/>
-                  </ns6:nvPicPr>
-                  <ns6:blipFill>
-                    <ns5:blip ns7:embed="rId9" cstate="print">
-                      <ns5:extLst>
-                        <ns5:ext uri="{28A0092B-C50C-407E-A947-70E740481C1C}">
-                          <ns8:useLocalDpi val="0"/>
-                        </ns5:ext>
-                      </ns5:extLst>
-                    </ns5:blip>
-                    <ns5:stretch>
-                      <ns5:fillRect/>
-                    </ns5:stretch>
-                  </ns6:blipFill>
-                  <ns6:spPr>
-                    <ns5:xfrm>
-                      <ns5:off x="0" y="0"/>
-                      <ns5:ext cx="1023620" cy="829945"/>
-                    </ns5:xfrm>
-                    <ns5:prstGeom prst="rect">
-                      <ns5:avLst/>
-                    </ns5:prstGeom>
-                  </ns6:spPr>
-                </ns6:pic>
-              </ns5:graphicData>
-            </ns5:graphic>
-            <ns4:sizeRelH relativeFrom="margin">
-              <ns4:pctWidth>0</ns4:pctWidth>
-            </ns4:sizeRelH>
-            <ns4:sizeRelV relativeFrom="margin">
-              <ns4:pctHeight>0</ns4:pctHeight>
-            </ns4:sizeRelV>
-          </ns3:anchor>
+          <wp:anchor distT="0" distB="0" distL="114300" distR="114300" simplePos="0" relativeHeight="251734016" behindDoc="0" locked="0" layoutInCell="1" allowOverlap="1" wp14:anchorId="11AF0A76" wp14:editId="34DCA072">
+            <wp:simplePos x="0" y="0"/>
+            <wp:positionH relativeFrom="margin">
+              <wp:align>right</wp:align>
+            </wp:positionH>
+            <wp:positionV relativeFrom="bottomMargin">
+              <wp:align>top</wp:align>
+            </wp:positionV>
+            <wp:extent cx="1023620" cy="829945"/>
+            <wp:effectExtent l="0" t="0" r="5080" b="8255"/>
+            <wp:wrapSquare wrapText="bothSides"/>
+            <wp:docPr id="1312645695" name="Obrázok 2" descr="Obrázok, na ktorom je text, písmo, logo, symbol&#10;&#10;Obsah vygenerovaný pomocou AI môže byť nesprávny."/>
+            <wp:cNvGraphicFramePr>
+              <a:graphicFrameLocks xmlns:a="http://schemas.openxmlformats.org/drawingml/2006/main" noChangeAspect="1"/>
+            </wp:cNvGraphicFramePr>
+            <a:graphic xmlns:a="http://schemas.openxmlformats.org/drawingml/2006/main">
+              <a:graphicData uri="http://schemas.openxmlformats.org/drawingml/2006/picture">
+                <pic:pic xmlns:pic="http://schemas.openxmlformats.org/drawingml/2006/picture">
+                  <pic:nvPicPr>
+                    <pic:cNvPr id="471563147" name="Obrázok 2" descr="Obrázok, na ktorom je text, písmo, logo, symbol&#10;&#10;Obsah vygenerovaný pomocou AI môže byť nesprávny."/>
+                    <pic:cNvPicPr/>
+                  </pic:nvPicPr>
+                  <pic:blipFill>
+                    <a:blip r:embed="rId9" cstate="print">
+                      <a:extLst>
+                        <a:ext uri="{28A0092B-C50C-407E-A947-70E740481C1C}">
+                          <a14:useLocalDpi xmlns:a14="http://schemas.microsoft.com/office/drawing/2010/main" val="0"/>
+                        </a:ext>
+                      </a:extLst>
+                    </a:blip>
+                    <a:stretch>
+                      <a:fillRect/>
+                    </a:stretch>
+                  </pic:blipFill>
+                  <pic:spPr>
+                    <a:xfrm>
+                      <a:off x="0" y="0"/>
+                      <a:ext cx="1023620" cy="829945"/>
+                    </a:xfrm>
+                    <a:prstGeom prst="rect">
+                      <a:avLst/>
+                    </a:prstGeom>
+                  </pic:spPr>
+                </pic:pic>
+              </a:graphicData>
+            </a:graphic>
+            <wp14:sizeRelH relativeFrom="margin">
+              <wp14:pctWidth>0</wp14:pctWidth>
+            </wp14:sizeRelH>
+            <wp14:sizeRelV relativeFrom="margin">
+              <wp14:pctHeight>0</wp14:pctHeight>
+            </wp14:sizeRelV>
+          </wp:anchor>
         </w:drawing>
       </w:r>
     </w:p>
-    <w:p ns2:paraId="4BDAAE70" ns2:textId="2AE0D096">
+    <w:p>
       <w:pPr>
         <w:jc w:val="center"/>
         <w:rPr>
@@ -739,11 +851,10 @@
           <w:highlight w:val="yellow"/>
           <w:u w:val="single"/>
         </w:rPr>
-        <w:lastRenderedPageBreak/>
         <w:t>Výmera strechy</w:t>
       </w:r>
     </w:p>
-    <w:p ns2:paraId="3453FC0F" ns2:textId="0DAECB62">
+    <w:p>
       <w:pPr>
         <w:rPr>
           <w:b/>
@@ -755,12 +866,6 @@
         </w:rPr>
       </w:pPr>
       <w:r>
-        <w:t xml:space="preserve">{vymera_text}</w:t>
-      </w:r>
-    </w:p>
-    <w:p ns2:paraId="381A3DAB" ns2:textId="77777777">
-      <w:pPr>
-        <w:jc w:val="center"/>
         <w:rPr>
           <w:b/>
           <w:color w:val="EE0000"/>
@@ -769,8 +874,12 @@
           <w:highlight w:val="yellow"/>
           <w:u w:val="single"/>
         </w:rPr>
-      </w:pPr>
-      <w:r>
+        <w:t>{vymera_text}</w:t>
+      </w:r>
+    </w:p>
+    <w:p>
+      <w:pPr>
+        <w:jc w:val="center"/>
         <w:rPr>
           <w:b/>
           <w:color w:val="EE0000"/>
@@ -779,11 +888,90 @@
           <w:highlight w:val="yellow"/>
           <w:u w:val="single"/>
         </w:rPr>
-        <w:lastRenderedPageBreak/>
+      </w:pPr>
+      <w:r>
+        <w:rPr>
+          <w:b/>
+          <w:color w:val="EE0000"/>
+          <w:sz w:val="32"/>
+          <w:szCs w:val="28"/>
+          <w:highlight w:val="yellow"/>
+          <w:u w:val="single"/>
+        </w:rPr>
+        <w:t>{#ma_vykres}</w:t>
+      </w:r>
+    </w:p>
+    <w:p>
+      <w:pPr>
+        <w:jc w:val="center"/>
+        <w:rPr>
+          <w:b/>
+          <w:color w:val="EE0000"/>
+          <w:szCs w:val="28"/>
+          <w:highlight w:val="yellow"/>
+          <w:u w:val="single"/>
+        </w:rPr>
+      </w:pPr>
+      <w:r>
+        <w:rPr>
+          <w:b/>
+          <w:color w:val="EE0000"/>
+          <w:szCs w:val="28"/>
+          <w:highlight w:val="yellow"/>
+          <w:u w:val="single"/>
+        </w:rPr>
+        <w:t>{%vykres_obrazok}</w:t>
+      </w:r>
+    </w:p>
+    <w:p>
+      <w:pPr>
+        <w:jc w:val="center"/>
+        <w:rPr>
+          <w:b/>
+          <w:color w:val="EE0000"/>
+          <w:sz w:val="32"/>
+          <w:szCs w:val="28"/>
+          <w:highlight w:val="yellow"/>
+          <w:u w:val="single"/>
+        </w:rPr>
+      </w:pPr>
+      <w:r>
+        <w:rPr>
+          <w:b/>
+          <w:color w:val="EE0000"/>
+          <w:sz w:val="32"/>
+          <w:szCs w:val="28"/>
+          <w:highlight w:val="yellow"/>
+          <w:u w:val="single"/>
+        </w:rPr>
+        <w:t>{/ma_vykres}</w:t>
+      </w:r>
+    </w:p>
+    <w:p>
+      <w:pPr>
+        <w:jc w:val="center"/>
+        <w:rPr>
+          <w:b/>
+          <w:color w:val="EE0000"/>
+          <w:sz w:val="32"/>
+          <w:szCs w:val="28"/>
+          <w:highlight w:val="yellow"/>
+          <w:u w:val="single"/>
+        </w:rPr>
+      </w:pPr>
+      <w:r>
+        <w:rPr>
+          <w:b/>
+          <w:color w:val="EE0000"/>
+          <w:sz w:val="32"/>
+          <w:szCs w:val="28"/>
+          <w:highlight w:val="yellow"/>
+          <w:u w:val="single"/>
+        </w:rPr>
         <w:t>Skladba strechy zo zateplením</w:t>
       </w:r>
     </w:p>
-    <w:p ns2:paraId="61BC8CC8" ns2:textId="77777777">
+    <w:p>
       <w:pPr>
         <w:rPr>
           <w:b/>
@@ -803,36 +991,28 @@
         <w:t>Navrhnutý materiál :</w:t>
       </w:r>
     </w:p>
-    <w:p ns2:paraId="1971AF52" ns2:textId="77777777">
-      <w:pPr>
-        <w:rPr>
-          <w:sz w:val="24"/>
-        </w:rPr>
-      </w:pPr>
-      <w:r>
-        <w:rPr>
-          <w:sz w:val="24"/>
-        </w:rPr>
-        <w:t xml:space="preserve">{#skladba_vrstvy}{polozka}{/skladba_vrstvy}</w:t>
-      </w:r>
-      <w:r>
-        <w:rPr>
-          <w:b/>
-          <w:bCs/>
-          <w:sz w:val="24"/>
-        </w:rPr>
-        <w:t/>
-      </w:r>
-    </w:p>
-    <w:p ns2:paraId="6B93A15B" ns2:textId="77777777">
-      <w:pPr>
-        <w:rPr>
-          <w:b/>
-          <w:sz w:val="24"/>
-        </w:rPr>
-      </w:pPr>
-    </w:p>
-    <w:p ns2:paraId="2B938459" ns2:textId="77777777">
+    <w:p>
+      <w:pPr>
+        <w:rPr>
+          <w:sz w:val="24"/>
+        </w:rPr>
+      </w:pPr>
+      <w:r>
+        <w:rPr>
+          <w:sz w:val="24"/>
+        </w:rPr>
+        <w:t>{#skladba_vrstvy}{polozka}{/skladba_vrstvy}</w:t>
+      </w:r>
+    </w:p>
+    <w:p>
+      <w:pPr>
+        <w:rPr>
+          <w:b/>
+          <w:sz w:val="24"/>
+        </w:rPr>
+      </w:pPr>
+    </w:p>
+    <w:p>
       <w:pPr>
         <w:rPr>
           <w:b/>
@@ -849,10 +1029,30 @@
           <w:highlight w:val="yellow"/>
           <w:u w:val="single"/>
         </w:rPr>
-        <w:t xml:space="preserve">Popis prác podľa položiek pre strechu :</w:t>
-      </w:r>
-    </w:p>
-    <w:p ns2:paraId="55491CFA" ns2:textId="77777777">
+        <w:t>Popis prác podľa položiek</w:t>
+      </w:r>
+      <w:r>
+        <w:rPr>
+          <w:b/>
+          <w:color w:val="EE0000"/>
+          <w:sz w:val="28"/>
+          <w:highlight w:val="yellow"/>
+          <w:u w:val="single"/>
+        </w:rPr>
+        <w:t xml:space="preserve"> pre strechu </w:t>
+      </w:r>
+      <w:r>
+        <w:rPr>
+          <w:b/>
+          <w:color w:val="EE0000"/>
+          <w:sz w:val="28"/>
+          <w:highlight w:val="yellow"/>
+          <w:u w:val="single"/>
+        </w:rPr>
+        <w:t>:</w:t>
+      </w:r>
+    </w:p>
+    <w:p>
       <w:pPr>
         <w:numPr>
           <w:ilvl w:val="0"/>
@@ -866,24 +1066,10 @@
         <w:rPr>
           <w:sz w:val="24"/>
         </w:rPr>
-        <w:t xml:space="preserve">{postup_prac}</w:t>
-      </w:r>
-      <w:r>
-        <w:rPr>
-          <w:b/>
-          <w:bCs/>
-          <w:sz w:val="24"/>
-        </w:rPr>
-        <w:t/>
-      </w:r>
-      <w:r>
-        <w:rPr>
-          <w:sz w:val="24"/>
-        </w:rPr>
-        <w:t/>
-      </w:r>
-    </w:p>
-    <w:p ns2:paraId="18F6AE89" ns2:textId="7BAB1EB0">
+        <w:t>{postup_prac}</w:t>
+      </w:r>
+    </w:p>
+    <w:p>
       <w:pPr>
         <w:jc w:val="center"/>
         <w:rPr>
@@ -902,36 +1088,10 @@
           <w:highlight w:val="yellow"/>
           <w:u w:val="single"/>
         </w:rPr>
-        <w:t xml:space="preserve">Technická charakteristika: {technicky_produkt_nazov}</w:t>
-      </w:r>
-      <w:r>
-        <w:rPr>
-          <w:b/>
-          <w:bCs/>
-          <w:color w:val="EE0000"/>
-          <w:sz w:val="32"/>
-          <w:szCs w:val="28"/>
-          <w:highlight w:val="yellow"/>
-          <w:u w:val="single"/>
-        </w:rPr>
-        <w:t xml:space="preserve"/>
-      </w:r>
-      <w:proofErr w:type="spellStart"/>
-      <w:r>
-        <w:rPr>
-          <w:b/>
-          <w:bCs/>
-          <w:color w:val="EE0000"/>
-          <w:sz w:val="32"/>
-          <w:szCs w:val="28"/>
-          <w:highlight w:val="yellow"/>
-          <w:u w:val="single"/>
-        </w:rPr>
-        <w:t/>
-      </w:r>
-      <w:proofErr w:type="spellEnd"/>
-    </w:p>
-    <w:p ns2:paraId="1C0138F7" ns2:textId="321A1CB1">
+        <w:t>Technická charakteristika: {technicky_produkt_nazov}</w:t>
+      </w:r>
+    </w:p>
+    <w:p>
       <w:pPr>
         <w:jc w:val="center"/>
         <w:rPr>
@@ -946,49 +1106,10 @@
           <w:sz w:val="20"/>
           <w:szCs w:val="18"/>
         </w:rPr>
-        <w:t xml:space="preserve">{technicky_produkt_popis}</w:t>
-      </w:r>
-      <w:r>
-        <w:rPr>
-          <w:sz w:val="20"/>
-          <w:szCs w:val="18"/>
-        </w:rPr>
-        <w:t/>
-      </w:r>
-      <w:proofErr w:type="spellStart"/>
-      <w:r>
-        <w:rPr>
-          <w:sz w:val="20"/>
-          <w:szCs w:val="18"/>
-        </w:rPr>
-        <w:t/>
-      </w:r>
-      <w:proofErr w:type="spellEnd"/>
-      <w:r>
-        <w:rPr>
-          <w:sz w:val="20"/>
-          <w:szCs w:val="18"/>
-        </w:rPr>
-        <w:t/>
-      </w:r>
-      <w:r>
-        <w:rPr>
-          <w:b/>
-          <w:bCs/>
-          <w:sz w:val="20"/>
-          <w:szCs w:val="18"/>
-        </w:rPr>
-        <w:t/>
-      </w:r>
-      <w:r>
-        <w:rPr>
-          <w:sz w:val="20"/>
-          <w:szCs w:val="18"/>
-        </w:rPr>
-        <w:t/>
-      </w:r>
-    </w:p>
-    <w:p ns2:paraId="5D6C5221" ns2:textId="72C4728E">
+        <w:t>{technicky_produkt_popis}</w:t>
+      </w:r>
+    </w:p>
+    <w:p>
       <w:pPr>
         <w:jc w:val="center"/>
         <w:rPr>
@@ -1003,61 +1124,60 @@
           <w:sz w:val="32"/>
           <w:szCs w:val="28"/>
         </w:rPr>
-        <w:lastRenderedPageBreak/>
         <w:drawing>
-          <ns3:anchor distT="0" distB="0" distL="114300" distR="114300" simplePos="0" relativeHeight="251717632" behindDoc="0" locked="0" layoutInCell="1" allowOverlap="1" ns4:anchorId="3994A431" ns4:editId="4CAF1780">
-            <ns3:simplePos x="0" y="0"/>
-            <ns3:positionH relativeFrom="margin">
-              <ns3:align>right</ns3:align>
-            </ns3:positionH>
-            <ns3:positionV relativeFrom="margin">
-              <ns3:posOffset>3085465</ns3:posOffset>
-            </ns3:positionV>
-            <ns3:extent cx="2806065" cy="2265045"/>
-            <ns3:effectExtent l="0" t="0" r="0" b="1905"/>
-            <ns3:wrapSquare wrapText="bothSides"/>
-            <ns3:docPr id="1443699373" name="Obrázok 5" descr="Obrázok, na ktorom je nebo, exteriér, zem, strom&#10;&#10;Obsah vygenerovaný pomocou AI môže byť nesprávny."/>
-            <ns3:cNvGraphicFramePr>
-              <ns5:graphicFrameLocks noChangeAspect="1"/>
-            </ns3:cNvGraphicFramePr>
-            <ns5:graphic>
-              <ns5:graphicData uri="http://schemas.openxmlformats.org/drawingml/2006/picture">
-                <ns6:pic>
-                  <ns6:nvPicPr>
-                    <ns6:cNvPr id="1443699373" name="Obrázok 5" descr="Obrázok, na ktorom je nebo, exteriér, zem, strom&#10;&#10;Obsah vygenerovaný pomocou AI môže byť nesprávny."/>
-                    <ns6:cNvPicPr/>
-                  </ns6:nvPicPr>
-                  <ns6:blipFill>
-                    <ns5:blip ns7:embed="rId16" cstate="print">
-                      <ns5:extLst>
-                        <ns5:ext uri="{28A0092B-C50C-407E-A947-70E740481C1C}">
-                          <ns8:useLocalDpi val="0"/>
-                        </ns5:ext>
-                      </ns5:extLst>
-                    </ns5:blip>
-                    <ns5:stretch>
-                      <ns5:fillRect/>
-                    </ns5:stretch>
-                  </ns6:blipFill>
-                  <ns6:spPr>
-                    <ns5:xfrm>
-                      <ns5:off x="0" y="0"/>
-                      <ns5:ext cx="2806065" cy="2265045"/>
-                    </ns5:xfrm>
-                    <ns5:prstGeom prst="rect">
-                      <ns5:avLst/>
-                    </ns5:prstGeom>
-                  </ns6:spPr>
-                </ns6:pic>
-              </ns5:graphicData>
-            </ns5:graphic>
-            <ns4:sizeRelH relativeFrom="margin">
-              <ns4:pctWidth>0</ns4:pctWidth>
-            </ns4:sizeRelH>
-            <ns4:sizeRelV relativeFrom="margin">
-              <ns4:pctHeight>0</ns4:pctHeight>
-            </ns4:sizeRelV>
-          </ns3:anchor>
+          <wp:anchor distT="0" distB="0" distL="114300" distR="114300" simplePos="0" relativeHeight="251717632" behindDoc="0" locked="0" layoutInCell="1" allowOverlap="1" wp14:anchorId="3994A431" wp14:editId="4CAF1780">
+            <wp:simplePos x="0" y="0"/>
+            <wp:positionH relativeFrom="margin">
+              <wp:align>right</wp:align>
+            </wp:positionH>
+            <wp:positionV relativeFrom="margin">
+              <wp:posOffset>3085465</wp:posOffset>
+            </wp:positionV>
+            <wp:extent cx="2806065" cy="2265045"/>
+            <wp:effectExtent l="0" t="0" r="0" b="1905"/>
+            <wp:wrapSquare wrapText="bothSides"/>
+            <wp:docPr id="1443699373" name="Obrázok 5" descr="Obrázok, na ktorom je nebo, exteriér, zem, strom&#10;&#10;Obsah vygenerovaný pomocou AI môže byť nesprávny."/>
+            <wp:cNvGraphicFramePr>
+              <a:graphicFrameLocks xmlns:a="http://schemas.openxmlformats.org/drawingml/2006/main" noChangeAspect="1"/>
+            </wp:cNvGraphicFramePr>
+            <a:graphic xmlns:a="http://schemas.openxmlformats.org/drawingml/2006/main">
+              <a:graphicData uri="http://schemas.openxmlformats.org/drawingml/2006/picture">
+                <pic:pic xmlns:pic="http://schemas.openxmlformats.org/drawingml/2006/picture">
+                  <pic:nvPicPr>
+                    <pic:cNvPr id="1443699373" name="Obrázok 5" descr="Obrázok, na ktorom je nebo, exteriér, zem, strom&#10;&#10;Obsah vygenerovaný pomocou AI môže byť nesprávny."/>
+                    <pic:cNvPicPr/>
+                  </pic:nvPicPr>
+                  <pic:blipFill>
+                    <a:blip r:embed="rId10" cstate="print">
+                      <a:extLst>
+                        <a:ext uri="{28A0092B-C50C-407E-A947-70E740481C1C}">
+                          <a14:useLocalDpi xmlns:a14="http://schemas.microsoft.com/office/drawing/2010/main" val="0"/>
+                        </a:ext>
+                      </a:extLst>
+                    </a:blip>
+                    <a:stretch>
+                      <a:fillRect/>
+                    </a:stretch>
+                  </pic:blipFill>
+                  <pic:spPr>
+                    <a:xfrm>
+                      <a:off x="0" y="0"/>
+                      <a:ext cx="2806065" cy="2265045"/>
+                    </a:xfrm>
+                    <a:prstGeom prst="rect">
+                      <a:avLst/>
+                    </a:prstGeom>
+                  </pic:spPr>
+                </pic:pic>
+              </a:graphicData>
+            </a:graphic>
+            <wp14:sizeRelH relativeFrom="margin">
+              <wp14:pctWidth>0</wp14:pctWidth>
+            </wp14:sizeRelH>
+            <wp14:sizeRelV relativeFrom="margin">
+              <wp14:pctHeight>0</wp14:pctHeight>
+            </wp14:sizeRelV>
+          </wp:anchor>
         </w:drawing>
       </w:r>
       <w:r>
@@ -1069,59 +1189,59 @@
           <w:szCs w:val="28"/>
         </w:rPr>
         <w:drawing>
-          <ns3:anchor distT="0" distB="0" distL="114300" distR="114300" simplePos="0" relativeHeight="251716608" behindDoc="0" locked="0" layoutInCell="1" allowOverlap="1" ns4:anchorId="0C07D4F0" ns4:editId="173E019A">
-            <ns3:simplePos x="0" y="0"/>
-            <ns3:positionH relativeFrom="margin">
-              <ns3:posOffset>-31115</ns3:posOffset>
-            </ns3:positionH>
-            <ns3:positionV relativeFrom="margin">
-              <ns3:posOffset>3091815</ns3:posOffset>
-            </ns3:positionV>
-            <ns3:extent cx="3009900" cy="2257425"/>
-            <ns3:effectExtent l="0" t="0" r="0" b="9525"/>
-            <ns3:wrapSquare wrapText="bothSides"/>
-            <ns3:docPr id="1003252883" name="Obrázok 4" descr="Obrázok, na ktorom je exteriér, nebo, lietadlo/hoblík, zem&#10;&#10;Obsah vygenerovaný pomocou AI môže byť nesprávny."/>
-            <ns3:cNvGraphicFramePr>
-              <ns5:graphicFrameLocks noChangeAspect="1"/>
-            </ns3:cNvGraphicFramePr>
-            <ns5:graphic>
-              <ns5:graphicData uri="http://schemas.openxmlformats.org/drawingml/2006/picture">
-                <ns6:pic>
-                  <ns6:nvPicPr>
-                    <ns6:cNvPr id="1003252883" name="Obrázok 4" descr="Obrázok, na ktorom je exteriér, nebo, lietadlo/hoblík, zem&#10;&#10;Obsah vygenerovaný pomocou AI môže byť nesprávny."/>
-                    <ns6:cNvPicPr/>
-                  </ns6:nvPicPr>
-                  <ns6:blipFill>
-                    <ns5:blip ns7:embed="rId17" cstate="print">
-                      <ns5:extLst>
-                        <ns5:ext uri="{28A0092B-C50C-407E-A947-70E740481C1C}">
-                          <ns8:useLocalDpi val="0"/>
-                        </ns5:ext>
-                      </ns5:extLst>
-                    </ns5:blip>
-                    <ns5:stretch>
-                      <ns5:fillRect/>
-                    </ns5:stretch>
-                  </ns6:blipFill>
-                  <ns6:spPr>
-                    <ns5:xfrm>
-                      <ns5:off x="0" y="0"/>
-                      <ns5:ext cx="3009900" cy="2257425"/>
-                    </ns5:xfrm>
-                    <ns5:prstGeom prst="rect">
-                      <ns5:avLst/>
-                    </ns5:prstGeom>
-                  </ns6:spPr>
-                </ns6:pic>
-              </ns5:graphicData>
-            </ns5:graphic>
-            <ns4:sizeRelH relativeFrom="margin">
-              <ns4:pctWidth>0</ns4:pctWidth>
-            </ns4:sizeRelH>
-            <ns4:sizeRelV relativeFrom="margin">
-              <ns4:pctHeight>0</ns4:pctHeight>
-            </ns4:sizeRelV>
-          </ns3:anchor>
+          <wp:anchor distT="0" distB="0" distL="114300" distR="114300" simplePos="0" relativeHeight="251716608" behindDoc="0" locked="0" layoutInCell="1" allowOverlap="1" wp14:anchorId="0C07D4F0" wp14:editId="173E019A">
+            <wp:simplePos x="0" y="0"/>
+            <wp:positionH relativeFrom="margin">
+              <wp:posOffset>-31115</wp:posOffset>
+            </wp:positionH>
+            <wp:positionV relativeFrom="margin">
+              <wp:posOffset>3091815</wp:posOffset>
+            </wp:positionV>
+            <wp:extent cx="3009900" cy="2257425"/>
+            <wp:effectExtent l="0" t="0" r="0" b="9525"/>
+            <wp:wrapSquare wrapText="bothSides"/>
+            <wp:docPr id="1003252883" name="Obrázok 4" descr="Obrázok, na ktorom je exteriér, nebo, lietadlo/hoblík, zem&#10;&#10;Obsah vygenerovaný pomocou AI môže byť nesprávny."/>
+            <wp:cNvGraphicFramePr>
+              <a:graphicFrameLocks xmlns:a="http://schemas.openxmlformats.org/drawingml/2006/main" noChangeAspect="1"/>
+            </wp:cNvGraphicFramePr>
+            <a:graphic xmlns:a="http://schemas.openxmlformats.org/drawingml/2006/main">
+              <a:graphicData uri="http://schemas.openxmlformats.org/drawingml/2006/picture">
+                <pic:pic xmlns:pic="http://schemas.openxmlformats.org/drawingml/2006/picture">
+                  <pic:nvPicPr>
+                    <pic:cNvPr id="1003252883" name="Obrázok 4" descr="Obrázok, na ktorom je exteriér, nebo, lietadlo/hoblík, zem&#10;&#10;Obsah vygenerovaný pomocou AI môže byť nesprávny."/>
+                    <pic:cNvPicPr/>
+                  </pic:nvPicPr>
+                  <pic:blipFill>
+                    <a:blip r:embed="rId11" cstate="print">
+                      <a:extLst>
+                        <a:ext uri="{28A0092B-C50C-407E-A947-70E740481C1C}">
+                          <a14:useLocalDpi xmlns:a14="http://schemas.microsoft.com/office/drawing/2010/main" val="0"/>
+                        </a:ext>
+                      </a:extLst>
+                    </a:blip>
+                    <a:stretch>
+                      <a:fillRect/>
+                    </a:stretch>
+                  </pic:blipFill>
+                  <pic:spPr>
+                    <a:xfrm>
+                      <a:off x="0" y="0"/>
+                      <a:ext cx="3009900" cy="2257425"/>
+                    </a:xfrm>
+                    <a:prstGeom prst="rect">
+                      <a:avLst/>
+                    </a:prstGeom>
+                  </pic:spPr>
+                </pic:pic>
+              </a:graphicData>
+            </a:graphic>
+            <wp14:sizeRelH relativeFrom="margin">
+              <wp14:pctWidth>0</wp14:pctWidth>
+            </wp14:sizeRelH>
+            <wp14:sizeRelV relativeFrom="margin">
+              <wp14:pctHeight>0</wp14:pctHeight>
+            </wp14:sizeRelV>
+          </wp:anchor>
         </w:drawing>
       </w:r>
       <w:r>
@@ -1133,59 +1253,59 @@
           <w:szCs w:val="28"/>
         </w:rPr>
         <w:drawing>
-          <ns3:anchor distT="0" distB="0" distL="114300" distR="114300" simplePos="0" relativeHeight="251713536" behindDoc="0" locked="0" layoutInCell="1" allowOverlap="1" ns4:anchorId="13C86628" ns4:editId="4D643D41">
-            <ns3:simplePos x="0" y="0"/>
-            <ns3:positionH relativeFrom="margin">
-              <ns3:posOffset>-635</ns3:posOffset>
-            </ns3:positionH>
-            <ns3:positionV relativeFrom="margin">
-              <ns3:posOffset>472440</ns3:posOffset>
-            </ns3:positionV>
-            <ns3:extent cx="2926080" cy="2736215"/>
-            <ns3:effectExtent l="0" t="0" r="7620" b="6985"/>
-            <ns3:wrapSquare wrapText="bothSides"/>
-            <ns3:docPr id="873670503" name="Obrázok 1" descr="Obrázok, na ktorom je exteriér, oblak, nebo, strom&#10;&#10;Obsah vygenerovaný pomocou AI môže byť nesprávny."/>
-            <ns3:cNvGraphicFramePr>
-              <ns5:graphicFrameLocks noChangeAspect="1"/>
-            </ns3:cNvGraphicFramePr>
-            <ns5:graphic>
-              <ns5:graphicData uri="http://schemas.openxmlformats.org/drawingml/2006/picture">
-                <ns6:pic>
-                  <ns6:nvPicPr>
-                    <ns6:cNvPr id="873670503" name="Obrázok 1" descr="Obrázok, na ktorom je exteriér, oblak, nebo, strom&#10;&#10;Obsah vygenerovaný pomocou AI môže byť nesprávny."/>
-                    <ns6:cNvPicPr/>
-                  </ns6:nvPicPr>
-                  <ns6:blipFill>
-                    <ns5:blip ns7:embed="rId18" cstate="print">
-                      <ns5:extLst>
-                        <ns5:ext uri="{28A0092B-C50C-407E-A947-70E740481C1C}">
-                          <ns8:useLocalDpi val="0"/>
-                        </ns5:ext>
-                      </ns5:extLst>
-                    </ns5:blip>
-                    <ns5:stretch>
-                      <ns5:fillRect/>
-                    </ns5:stretch>
-                  </ns6:blipFill>
-                  <ns6:spPr>
-                    <ns5:xfrm>
-                      <ns5:off x="0" y="0"/>
-                      <ns5:ext cx="2926080" cy="2736215"/>
-                    </ns5:xfrm>
-                    <ns5:prstGeom prst="rect">
-                      <ns5:avLst/>
-                    </ns5:prstGeom>
-                  </ns6:spPr>
-                </ns6:pic>
-              </ns5:graphicData>
-            </ns5:graphic>
-            <ns4:sizeRelH relativeFrom="margin">
-              <ns4:pctWidth>0</ns4:pctWidth>
-            </ns4:sizeRelH>
-            <ns4:sizeRelV relativeFrom="margin">
-              <ns4:pctHeight>0</ns4:pctHeight>
-            </ns4:sizeRelV>
-          </ns3:anchor>
+          <wp:anchor distT="0" distB="0" distL="114300" distR="114300" simplePos="0" relativeHeight="251713536" behindDoc="0" locked="0" layoutInCell="1" allowOverlap="1" wp14:anchorId="13C86628" wp14:editId="4D643D41">
+            <wp:simplePos x="0" y="0"/>
+            <wp:positionH relativeFrom="margin">
+              <wp:posOffset>-635</wp:posOffset>
+            </wp:positionH>
+            <wp:positionV relativeFrom="margin">
+              <wp:posOffset>472440</wp:posOffset>
+            </wp:positionV>
+            <wp:extent cx="2926080" cy="2736215"/>
+            <wp:effectExtent l="0" t="0" r="7620" b="6985"/>
+            <wp:wrapSquare wrapText="bothSides"/>
+            <wp:docPr id="873670503" name="Obrázok 1" descr="Obrázok, na ktorom je exteriér, oblak, nebo, strom&#10;&#10;Obsah vygenerovaný pomocou AI môže byť nesprávny."/>
+            <wp:cNvGraphicFramePr>
+              <a:graphicFrameLocks xmlns:a="http://schemas.openxmlformats.org/drawingml/2006/main" noChangeAspect="1"/>
+            </wp:cNvGraphicFramePr>
+            <a:graphic xmlns:a="http://schemas.openxmlformats.org/drawingml/2006/main">
+              <a:graphicData uri="http://schemas.openxmlformats.org/drawingml/2006/picture">
+                <pic:pic xmlns:pic="http://schemas.openxmlformats.org/drawingml/2006/picture">
+                  <pic:nvPicPr>
+                    <pic:cNvPr id="873670503" name="Obrázok 1" descr="Obrázok, na ktorom je exteriér, oblak, nebo, strom&#10;&#10;Obsah vygenerovaný pomocou AI môže byť nesprávny."/>
+                    <pic:cNvPicPr/>
+                  </pic:nvPicPr>
+                  <pic:blipFill>
+                    <a:blip r:embed="rId12" cstate="print">
+                      <a:extLst>
+                        <a:ext uri="{28A0092B-C50C-407E-A947-70E740481C1C}">
+                          <a14:useLocalDpi xmlns:a14="http://schemas.microsoft.com/office/drawing/2010/main" val="0"/>
+                        </a:ext>
+                      </a:extLst>
+                    </a:blip>
+                    <a:stretch>
+                      <a:fillRect/>
+                    </a:stretch>
+                  </pic:blipFill>
+                  <pic:spPr>
+                    <a:xfrm>
+                      <a:off x="0" y="0"/>
+                      <a:ext cx="2926080" cy="2736215"/>
+                    </a:xfrm>
+                    <a:prstGeom prst="rect">
+                      <a:avLst/>
+                    </a:prstGeom>
+                  </pic:spPr>
+                </pic:pic>
+              </a:graphicData>
+            </a:graphic>
+            <wp14:sizeRelH relativeFrom="margin">
+              <wp14:pctWidth>0</wp14:pctWidth>
+            </wp14:sizeRelH>
+            <wp14:sizeRelV relativeFrom="margin">
+              <wp14:pctHeight>0</wp14:pctHeight>
+            </wp14:sizeRelV>
+          </wp:anchor>
         </w:drawing>
       </w:r>
       <w:r>
@@ -1197,59 +1317,59 @@
           <w:szCs w:val="28"/>
         </w:rPr>
         <w:drawing>
-          <ns3:anchor distT="0" distB="0" distL="114300" distR="114300" simplePos="0" relativeHeight="251714560" behindDoc="0" locked="0" layoutInCell="1" allowOverlap="1" ns4:anchorId="60CE12A2" ns4:editId="39D3C1B9">
-            <ns3:simplePos x="0" y="0"/>
-            <ns3:positionH relativeFrom="margin">
-              <ns3:align>right</ns3:align>
-            </ns3:positionH>
-            <ns3:positionV relativeFrom="margin">
-              <ns3:posOffset>478790</ns3:posOffset>
-            </ns3:positionV>
-            <ns3:extent cx="2861945" cy="2751455"/>
-            <ns3:effectExtent l="0" t="0" r="0" b="0"/>
-            <ns3:wrapSquare wrapText="bothSides"/>
-            <ns3:docPr id="1126206296" name="Obrázok 2" descr="Obrázok, na ktorom je exteriér, strom, nebo, dom&#10;&#10;Obsah vygenerovaný pomocou AI môže byť nesprávny."/>
-            <ns3:cNvGraphicFramePr>
-              <ns5:graphicFrameLocks noChangeAspect="1"/>
-            </ns3:cNvGraphicFramePr>
-            <ns5:graphic>
-              <ns5:graphicData uri="http://schemas.openxmlformats.org/drawingml/2006/picture">
-                <ns6:pic>
-                  <ns6:nvPicPr>
-                    <ns6:cNvPr id="1126206296" name="Obrázok 2" descr="Obrázok, na ktorom je exteriér, strom, nebo, dom&#10;&#10;Obsah vygenerovaný pomocou AI môže byť nesprávny."/>
-                    <ns6:cNvPicPr/>
-                  </ns6:nvPicPr>
-                  <ns6:blipFill>
-                    <ns5:blip ns7:embed="rId19" cstate="print">
-                      <ns5:extLst>
-                        <ns5:ext uri="{28A0092B-C50C-407E-A947-70E740481C1C}">
-                          <ns8:useLocalDpi val="0"/>
-                        </ns5:ext>
-                      </ns5:extLst>
-                    </ns5:blip>
-                    <ns5:stretch>
-                      <ns5:fillRect/>
-                    </ns5:stretch>
-                  </ns6:blipFill>
-                  <ns6:spPr>
-                    <ns5:xfrm>
-                      <ns5:off x="0" y="0"/>
-                      <ns5:ext cx="2861945" cy="2751455"/>
-                    </ns5:xfrm>
-                    <ns5:prstGeom prst="rect">
-                      <ns5:avLst/>
-                    </ns5:prstGeom>
-                  </ns6:spPr>
-                </ns6:pic>
-              </ns5:graphicData>
-            </ns5:graphic>
-            <ns4:sizeRelH relativeFrom="margin">
-              <ns4:pctWidth>0</ns4:pctWidth>
-            </ns4:sizeRelH>
-            <ns4:sizeRelV relativeFrom="margin">
-              <ns4:pctHeight>0</ns4:pctHeight>
-            </ns4:sizeRelV>
-          </ns3:anchor>
+          <wp:anchor distT="0" distB="0" distL="114300" distR="114300" simplePos="0" relativeHeight="251714560" behindDoc="0" locked="0" layoutInCell="1" allowOverlap="1" wp14:anchorId="60CE12A2" wp14:editId="39D3C1B9">
+            <wp:simplePos x="0" y="0"/>
+            <wp:positionH relativeFrom="margin">
+              <wp:align>right</wp:align>
+            </wp:positionH>
+            <wp:positionV relativeFrom="margin">
+              <wp:posOffset>478790</wp:posOffset>
+            </wp:positionV>
+            <wp:extent cx="2861945" cy="2751455"/>
+            <wp:effectExtent l="0" t="0" r="0" b="0"/>
+            <wp:wrapSquare wrapText="bothSides"/>
+            <wp:docPr id="1126206296" name="Obrázok 2" descr="Obrázok, na ktorom je exteriér, strom, nebo, dom&#10;&#10;Obsah vygenerovaný pomocou AI môže byť nesprávny."/>
+            <wp:cNvGraphicFramePr>
+              <a:graphicFrameLocks xmlns:a="http://schemas.openxmlformats.org/drawingml/2006/main" noChangeAspect="1"/>
+            </wp:cNvGraphicFramePr>
+            <a:graphic xmlns:a="http://schemas.openxmlformats.org/drawingml/2006/main">
+              <a:graphicData uri="http://schemas.openxmlformats.org/drawingml/2006/picture">
+                <pic:pic xmlns:pic="http://schemas.openxmlformats.org/drawingml/2006/picture">
+                  <pic:nvPicPr>
+                    <pic:cNvPr id="1126206296" name="Obrázok 2" descr="Obrázok, na ktorom je exteriér, strom, nebo, dom&#10;&#10;Obsah vygenerovaný pomocou AI môže byť nesprávny."/>
+                    <pic:cNvPicPr/>
+                  </pic:nvPicPr>
+                  <pic:blipFill>
+                    <a:blip r:embed="rId13" cstate="print">
+                      <a:extLst>
+                        <a:ext uri="{28A0092B-C50C-407E-A947-70E740481C1C}">
+                          <a14:useLocalDpi xmlns:a14="http://schemas.microsoft.com/office/drawing/2010/main" val="0"/>
+                        </a:ext>
+                      </a:extLst>
+                    </a:blip>
+                    <a:stretch>
+                      <a:fillRect/>
+                    </a:stretch>
+                  </pic:blipFill>
+                  <pic:spPr>
+                    <a:xfrm>
+                      <a:off x="0" y="0"/>
+                      <a:ext cx="2861945" cy="2751455"/>
+                    </a:xfrm>
+                    <a:prstGeom prst="rect">
+                      <a:avLst/>
+                    </a:prstGeom>
+                  </pic:spPr>
+                </pic:pic>
+              </a:graphicData>
+            </a:graphic>
+            <wp14:sizeRelH relativeFrom="margin">
+              <wp14:pctWidth>0</wp14:pctWidth>
+            </wp14:sizeRelH>
+            <wp14:sizeRelV relativeFrom="margin">
+              <wp14:pctHeight>0</wp14:pctHeight>
+            </wp14:sizeRelV>
+          </wp:anchor>
         </w:drawing>
       </w:r>
       <w:r>
@@ -1265,7 +1385,7 @@
         <w:t>Menšia ukážka realizovaných striech</w:t>
       </w:r>
     </w:p>
-    <w:p ns2:paraId="5214F10B" ns2:textId="0991529F">
+    <w:p>
       <w:pPr>
         <w:jc w:val="center"/>
         <w:rPr>
@@ -1286,63 +1406,63 @@
           <w:szCs w:val="28"/>
         </w:rPr>
         <w:drawing>
-          <ns3:anchor distT="0" distB="0" distL="114300" distR="114300" simplePos="0" relativeHeight="251679743" behindDoc="0" locked="0" layoutInCell="1" allowOverlap="1" ns4:anchorId="351A1939" ns4:editId="13EBD02C">
-            <ns3:simplePos x="0" y="0"/>
-            <ns3:positionH relativeFrom="margin">
-              <ns3:align>center</ns3:align>
-            </ns3:positionH>
-            <ns3:positionV relativeFrom="margin">
-              <ns3:posOffset>5363845</ns3:posOffset>
-            </ns3:positionV>
-            <ns3:extent cx="4968240" cy="3711575"/>
-            <ns3:effectExtent l="0" t="0" r="3810" b="3175"/>
-            <ns3:wrapSquare wrapText="bothSides"/>
-            <ns3:docPr id="98331591" name="Obrázok 3" descr="Obrázok, na ktorom je nebo, exteriér, oblak, budova&#10;&#10;Obsah vygenerovaný pomocou AI môže byť nesprávny."/>
-            <ns3:cNvGraphicFramePr>
-              <ns5:graphicFrameLocks noChangeAspect="1"/>
-            </ns3:cNvGraphicFramePr>
-            <ns5:graphic>
-              <ns5:graphicData uri="http://schemas.openxmlformats.org/drawingml/2006/picture">
-                <ns6:pic>
-                  <ns6:nvPicPr>
-                    <ns6:cNvPr id="98331591" name="Obrázok 3" descr="Obrázok, na ktorom je nebo, exteriér, oblak, budova&#10;&#10;Obsah vygenerovaný pomocou AI môže byť nesprávny."/>
-                    <ns6:cNvPicPr/>
-                  </ns6:nvPicPr>
-                  <ns6:blipFill>
-                    <ns5:blip ns7:embed="rId20" cstate="print">
-                      <ns5:extLst>
-                        <ns5:ext uri="{28A0092B-C50C-407E-A947-70E740481C1C}">
-                          <ns8:useLocalDpi val="0"/>
-                        </ns5:ext>
-                      </ns5:extLst>
-                    </ns5:blip>
-                    <ns5:stretch>
-                      <ns5:fillRect/>
-                    </ns5:stretch>
-                  </ns6:blipFill>
-                  <ns6:spPr>
-                    <ns5:xfrm>
-                      <ns5:off x="0" y="0"/>
-                      <ns5:ext cx="4968240" cy="3711575"/>
-                    </ns5:xfrm>
-                    <ns5:prstGeom prst="rect">
-                      <ns5:avLst/>
-                    </ns5:prstGeom>
-                  </ns6:spPr>
-                </ns6:pic>
-              </ns5:graphicData>
-            </ns5:graphic>
-            <ns4:sizeRelH relativeFrom="margin">
-              <ns4:pctWidth>0</ns4:pctWidth>
-            </ns4:sizeRelH>
-            <ns4:sizeRelV relativeFrom="margin">
-              <ns4:pctHeight>0</ns4:pctHeight>
-            </ns4:sizeRelV>
-          </ns3:anchor>
+          <wp:anchor distT="0" distB="0" distL="114300" distR="114300" simplePos="0" relativeHeight="251679743" behindDoc="0" locked="0" layoutInCell="1" allowOverlap="1" wp14:anchorId="351A1939" wp14:editId="15F2A3C8">
+            <wp:simplePos x="0" y="0"/>
+            <wp:positionH relativeFrom="margin">
+              <wp:align>center</wp:align>
+            </wp:positionH>
+            <wp:positionV relativeFrom="margin">
+              <wp:posOffset>5363845</wp:posOffset>
+            </wp:positionV>
+            <wp:extent cx="4968240" cy="3711575"/>
+            <wp:effectExtent l="0" t="0" r="3810" b="3175"/>
+            <wp:wrapSquare wrapText="bothSides"/>
+            <wp:docPr id="98331591" name="Obrázok 3" descr="Obrázok, na ktorom je nebo, exteriér, oblak, budova&#10;&#10;Obsah vygenerovaný pomocou AI môže byť nesprávny."/>
+            <wp:cNvGraphicFramePr>
+              <a:graphicFrameLocks xmlns:a="http://schemas.openxmlformats.org/drawingml/2006/main" noChangeAspect="1"/>
+            </wp:cNvGraphicFramePr>
+            <a:graphic xmlns:a="http://schemas.openxmlformats.org/drawingml/2006/main">
+              <a:graphicData uri="http://schemas.openxmlformats.org/drawingml/2006/picture">
+                <pic:pic xmlns:pic="http://schemas.openxmlformats.org/drawingml/2006/picture">
+                  <pic:nvPicPr>
+                    <pic:cNvPr id="98331591" name="Obrázok 3" descr="Obrázok, na ktorom je nebo, exteriér, oblak, budova&#10;&#10;Obsah vygenerovaný pomocou AI môže byť nesprávny."/>
+                    <pic:cNvPicPr/>
+                  </pic:nvPicPr>
+                  <pic:blipFill>
+                    <a:blip r:embed="rId14" cstate="print">
+                      <a:extLst>
+                        <a:ext uri="{28A0092B-C50C-407E-A947-70E740481C1C}">
+                          <a14:useLocalDpi xmlns:a14="http://schemas.microsoft.com/office/drawing/2010/main" val="0"/>
+                        </a:ext>
+                      </a:extLst>
+                    </a:blip>
+                    <a:stretch>
+                      <a:fillRect/>
+                    </a:stretch>
+                  </pic:blipFill>
+                  <pic:spPr>
+                    <a:xfrm>
+                      <a:off x="0" y="0"/>
+                      <a:ext cx="4968240" cy="3711575"/>
+                    </a:xfrm>
+                    <a:prstGeom prst="rect">
+                      <a:avLst/>
+                    </a:prstGeom>
+                  </pic:spPr>
+                </pic:pic>
+              </a:graphicData>
+            </a:graphic>
+            <wp14:sizeRelH relativeFrom="margin">
+              <wp14:pctWidth>0</wp14:pctWidth>
+            </wp14:sizeRelH>
+            <wp14:sizeRelV relativeFrom="margin">
+              <wp14:pctHeight>0</wp14:pctHeight>
+            </wp14:sizeRelV>
+          </wp:anchor>
         </w:drawing>
       </w:r>
     </w:p>
-    <w:p ns2:paraId="6899CC80" ns2:textId="3ACB6904">
+    <w:p>
       <w:pPr>
         <w:jc w:val="center"/>
         <w:rPr>
@@ -1356,7 +1476,7 @@
         </w:rPr>
       </w:pPr>
     </w:p>
-    <w:p ns2:paraId="723B9E51" ns2:textId="7C7E04F6">
+    <w:p>
       <w:pPr>
         <w:ind w:left="720"/>
         <w:jc w:val="center"/>
@@ -1369,7 +1489,7 @@
         </w:rPr>
       </w:pPr>
     </w:p>
-    <w:p ns2:paraId="42E28EC6" ns2:textId="3A1D19EE">
+    <w:p>
       <w:pPr>
         <w:ind w:left="720"/>
         <w:jc w:val="center"/>
@@ -1382,7 +1502,7 @@
         </w:rPr>
       </w:pPr>
     </w:p>
-    <w:p ns2:paraId="0079F89B" ns2:textId="1FD9B5D0">
+    <w:p>
       <w:pPr>
         <w:ind w:left="720"/>
         <w:jc w:val="center"/>
@@ -1395,7 +1515,7 @@
         </w:rPr>
       </w:pPr>
     </w:p>
-    <w:p ns2:paraId="41A631A8" ns2:textId="7F8C54D2">
+    <w:p>
       <w:pPr>
         <w:ind w:left="720"/>
         <w:jc w:val="center"/>
@@ -1408,7 +1528,7 @@
         </w:rPr>
       </w:pPr>
     </w:p>
-    <w:p ns2:paraId="695B05E1" ns2:textId="04EF367E">
+    <w:p>
       <w:pPr>
         <w:ind w:left="720"/>
         <w:jc w:val="center"/>
@@ -1421,7 +1541,7 @@
         </w:rPr>
       </w:pPr>
     </w:p>
-    <w:p ns2:paraId="0F6A4383" ns2:textId="6EF296BB">
+    <w:p>
       <w:pPr>
         <w:ind w:left="720"/>
         <w:jc w:val="center"/>
@@ -1434,7 +1554,7 @@
         </w:rPr>
       </w:pPr>
     </w:p>
-    <w:p ns2:paraId="4E6E6D0B" ns2:textId="3A5A63FA">
+    <w:p>
       <w:pPr>
         <w:ind w:left="720"/>
         <w:jc w:val="center"/>
@@ -1447,7 +1567,7 @@
         </w:rPr>
       </w:pPr>
     </w:p>
-    <w:p ns2:paraId="0682C3E1" ns2:textId="38BA2FAF">
+    <w:p>
       <w:pPr>
         <w:ind w:left="720"/>
         <w:jc w:val="center"/>
@@ -1467,63 +1587,63 @@
           <w:sz w:val="36"/>
         </w:rPr>
         <w:drawing>
-          <ns3:anchor distT="0" distB="0" distL="114300" distR="114300" simplePos="0" relativeHeight="251742208" behindDoc="0" locked="0" layoutInCell="1" allowOverlap="1" ns4:anchorId="364B2E11" ns4:editId="1D1A2653">
-            <ns3:simplePos x="0" y="0"/>
-            <ns3:positionH relativeFrom="margin">
-              <ns3:align>right</ns3:align>
-            </ns3:positionH>
-            <ns3:positionV relativeFrom="bottomMargin">
-              <ns3:align>top</ns3:align>
-            </ns3:positionV>
-            <ns3:extent cx="1023620" cy="829945"/>
-            <ns3:effectExtent l="0" t="0" r="5080" b="8255"/>
-            <ns3:wrapSquare wrapText="bothSides"/>
-            <ns3:docPr id="1556442866" name="Obrázok 2" descr="Obrázok, na ktorom je text, písmo, logo, symbol&#10;&#10;Obsah vygenerovaný pomocou AI môže byť nesprávny."/>
-            <ns3:cNvGraphicFramePr>
-              <ns5:graphicFrameLocks noChangeAspect="1"/>
-            </ns3:cNvGraphicFramePr>
-            <ns5:graphic>
-              <ns5:graphicData uri="http://schemas.openxmlformats.org/drawingml/2006/picture">
-                <ns6:pic>
-                  <ns6:nvPicPr>
-                    <ns6:cNvPr id="471563147" name="Obrázok 2" descr="Obrázok, na ktorom je text, písmo, logo, symbol&#10;&#10;Obsah vygenerovaný pomocou AI môže byť nesprávny."/>
-                    <ns6:cNvPicPr/>
-                  </ns6:nvPicPr>
-                  <ns6:blipFill>
-                    <ns5:blip ns7:embed="rId9" cstate="print">
-                      <ns5:extLst>
-                        <ns5:ext uri="{28A0092B-C50C-407E-A947-70E740481C1C}">
-                          <ns8:useLocalDpi val="0"/>
-                        </ns5:ext>
-                      </ns5:extLst>
-                    </ns5:blip>
-                    <ns5:stretch>
-                      <ns5:fillRect/>
-                    </ns5:stretch>
-                  </ns6:blipFill>
-                  <ns6:spPr>
-                    <ns5:xfrm>
-                      <ns5:off x="0" y="0"/>
-                      <ns5:ext cx="1023620" cy="829945"/>
-                    </ns5:xfrm>
-                    <ns5:prstGeom prst="rect">
-                      <ns5:avLst/>
-                    </ns5:prstGeom>
-                  </ns6:spPr>
-                </ns6:pic>
-              </ns5:graphicData>
-            </ns5:graphic>
-            <ns4:sizeRelH relativeFrom="margin">
-              <ns4:pctWidth>0</ns4:pctWidth>
-            </ns4:sizeRelH>
-            <ns4:sizeRelV relativeFrom="margin">
-              <ns4:pctHeight>0</ns4:pctHeight>
-            </ns4:sizeRelV>
-          </ns3:anchor>
+          <wp:anchor distT="0" distB="0" distL="114300" distR="114300" simplePos="0" relativeHeight="251742208" behindDoc="0" locked="0" layoutInCell="1" allowOverlap="1" wp14:anchorId="364B2E11" wp14:editId="1D1A2653">
+            <wp:simplePos x="0" y="0"/>
+            <wp:positionH relativeFrom="margin">
+              <wp:align>right</wp:align>
+            </wp:positionH>
+            <wp:positionV relativeFrom="bottomMargin">
+              <wp:align>top</wp:align>
+            </wp:positionV>
+            <wp:extent cx="1023620" cy="829945"/>
+            <wp:effectExtent l="0" t="0" r="5080" b="8255"/>
+            <wp:wrapSquare wrapText="bothSides"/>
+            <wp:docPr id="1556442866" name="Obrázok 2" descr="Obrázok, na ktorom je text, písmo, logo, symbol&#10;&#10;Obsah vygenerovaný pomocou AI môže byť nesprávny."/>
+            <wp:cNvGraphicFramePr>
+              <a:graphicFrameLocks xmlns:a="http://schemas.openxmlformats.org/drawingml/2006/main" noChangeAspect="1"/>
+            </wp:cNvGraphicFramePr>
+            <a:graphic xmlns:a="http://schemas.openxmlformats.org/drawingml/2006/main">
+              <a:graphicData uri="http://schemas.openxmlformats.org/drawingml/2006/picture">
+                <pic:pic xmlns:pic="http://schemas.openxmlformats.org/drawingml/2006/picture">
+                  <pic:nvPicPr>
+                    <pic:cNvPr id="471563147" name="Obrázok 2" descr="Obrázok, na ktorom je text, písmo, logo, symbol&#10;&#10;Obsah vygenerovaný pomocou AI môže byť nesprávny."/>
+                    <pic:cNvPicPr/>
+                  </pic:nvPicPr>
+                  <pic:blipFill>
+                    <a:blip r:embed="rId9" cstate="print">
+                      <a:extLst>
+                        <a:ext uri="{28A0092B-C50C-407E-A947-70E740481C1C}">
+                          <a14:useLocalDpi xmlns:a14="http://schemas.microsoft.com/office/drawing/2010/main" val="0"/>
+                        </a:ext>
+                      </a:extLst>
+                    </a:blip>
+                    <a:stretch>
+                      <a:fillRect/>
+                    </a:stretch>
+                  </pic:blipFill>
+                  <pic:spPr>
+                    <a:xfrm>
+                      <a:off x="0" y="0"/>
+                      <a:ext cx="1023620" cy="829945"/>
+                    </a:xfrm>
+                    <a:prstGeom prst="rect">
+                      <a:avLst/>
+                    </a:prstGeom>
+                  </pic:spPr>
+                </pic:pic>
+              </a:graphicData>
+            </a:graphic>
+            <wp14:sizeRelH relativeFrom="margin">
+              <wp14:pctWidth>0</wp14:pctWidth>
+            </wp14:sizeRelH>
+            <wp14:sizeRelV relativeFrom="margin">
+              <wp14:pctHeight>0</wp14:pctHeight>
+            </wp14:sizeRelV>
+          </wp:anchor>
         </w:drawing>
       </w:r>
     </w:p>
-    <w:p ns2:paraId="0C193692" ns2:textId="77777777">
+    <w:p>
       <w:pPr>
         <w:ind w:left="720"/>
         <w:jc w:val="center"/>
@@ -1539,11 +1659,10 @@
           <w:szCs w:val="28"/>
           <w:highlight w:val="yellow"/>
         </w:rPr>
-        <w:lastRenderedPageBreak/>
         <w:t>Hlavné výhody pre Vás (Zhrnutie)</w:t>
       </w:r>
     </w:p>
-    <w:p ns2:paraId="3E4F4639" ns2:textId="77777777">
+    <w:p>
       <w:pPr>
         <w:numPr>
           <w:ilvl w:val="0"/>
@@ -1575,7 +1694,7 @@
         <w:t> Vytvárame strechu, ktorá prežije generáciu, nielen záručnú dobu.</w:t>
       </w:r>
     </w:p>
-    <w:p ns2:paraId="0245C19E" ns2:textId="77777777">
+    <w:p>
       <w:pPr>
         <w:numPr>
           <w:ilvl w:val="0"/>
@@ -1604,10 +1723,22 @@
         <w:rPr>
           <w:sz w:val="24"/>
         </w:rPr>
-        <w:t xml:space="preserve"> Všetky pásy sú chemicky kompatibilné, čo zabezpečuje dokonalé spojenie vrstiev do jedného monolitického celku.</w:t>
-      </w:r>
-    </w:p>
-    <w:p ns2:paraId="492173C2" ns2:textId="77777777">
+        <w:t> </w:t>
+      </w:r>
+      <w:r>
+        <w:rPr>
+          <w:sz w:val="24"/>
+        </w:rPr>
+        <w:t>Všetky</w:t>
+      </w:r>
+      <w:r>
+        <w:rPr>
+          <w:sz w:val="24"/>
+        </w:rPr>
+        <w:t xml:space="preserve"> pásy sú chemicky kompatibilné, čo zabezpečuje dokonalé spojenie vrstiev do jedného monolitického celku.</w:t>
+      </w:r>
+    </w:p>
+    <w:p>
       <w:pPr>
         <w:numPr>
           <w:ilvl w:val="0"/>
@@ -1639,15 +1770,15 @@
         <w:t> Vďaka expanznej funkcii spodného pásu je Vaša strecha chránená proti deštruktívnemu tlaku vodných pár.</w:t>
       </w:r>
     </w:p>
-    <w:p ns2:paraId="2362BD83" ns2:textId="77777777">
-      <w:pPr>
-        <w:jc w:val="center"/>
-        <w:rPr>
-          <w:sz w:val="24"/>
-        </w:rPr>
-      </w:pPr>
-    </w:p>
-    <w:p ns2:paraId="1E0D0184" ns2:textId="77777777">
+    <w:p>
+      <w:pPr>
+        <w:jc w:val="center"/>
+        <w:rPr>
+          <w:sz w:val="24"/>
+        </w:rPr>
+      </w:pPr>
+    </w:p>
+    <w:p>
       <w:pPr>
         <w:jc w:val="center"/>
         <w:rPr>
@@ -1664,9 +1795,17 @@
           <w:sz w:val="28"/>
           <w:szCs w:val="24"/>
         </w:rPr>
-        <w:t>​Na rozdiel od bežných riešení, ktoré často podceňujú tepelnú stabilitu a odvod vlhkosti, sme pre vašu strechu zvolili kombináciu špičkových materiálov, ktoré reagujú na jej aktuálny stav. Finálna vrstva </w:t>
-      </w:r>
-      <w:proofErr w:type="spellStart"/>
+        <w:t>​</w:t>
+      </w:r>
+      <w:r>
+        <w:rPr>
+          <w:i/>
+          <w:iCs/>
+          <w:sz w:val="28"/>
+          <w:szCs w:val="24"/>
+        </w:rPr>
+        <w:t>Na rozdiel od bežných riešení, ktoré často podceňujú tepelnú stabilitu a odvod vlhkosti, sme pre vašu strechu zvolili kombináciu špičkových materiálov, ktoré reagujú na jej aktuálny stav. Finálna vrstva </w:t>
+      </w:r>
       <w:r>
         <w:rPr>
           <w:b/>
@@ -1676,9 +1815,17 @@
           <w:sz w:val="28"/>
           <w:szCs w:val="24"/>
         </w:rPr>
-        <w:t>Bitutop</w:t>
-      </w:r>
-      <w:proofErr w:type="spellEnd"/>
+        <w:t>Bitutop APAO</w:t>
+      </w:r>
+      <w:r>
+        <w:rPr>
+          <w:i/>
+          <w:iCs/>
+          <w:sz w:val="28"/>
+          <w:szCs w:val="24"/>
+        </w:rPr>
+        <w:t> je modifikovaná tak, aby odolávala teplotám až do </w:t>
+      </w:r>
       <w:r>
         <w:rPr>
           <w:b/>
@@ -1688,7 +1835,7 @@
           <w:sz w:val="28"/>
           <w:szCs w:val="24"/>
         </w:rPr>
-        <w:t xml:space="preserve"> APAO</w:t>
+        <w:t>130 °C</w:t>
       </w:r>
       <w:r>
         <w:rPr>
@@ -1697,7 +1844,7 @@
           <w:sz w:val="28"/>
           <w:szCs w:val="24"/>
         </w:rPr>
-        <w:t> je modifikovaná tak, aby odolávala teplotám až do </w:t>
+        <w:t>. To zaručuje, že ani počas najhorúcejších letných dní, kedy sa povrch strechy extrémne prehrieva, asfalt netečie, nedeformuje sa a zachováva si svoju pružnosť.</w:t>
       </w:r>
       <w:r>
         <w:rPr>
@@ -1708,7 +1855,7 @@
           <w:sz w:val="28"/>
           <w:szCs w:val="24"/>
         </w:rPr>
-        <w:t>130 °C</w:t>
+        <w:t xml:space="preserve"> </w:t>
       </w:r>
       <w:r>
         <w:rPr>
@@ -1717,7 +1864,7 @@
           <w:sz w:val="28"/>
           <w:szCs w:val="24"/>
         </w:rPr>
-        <w:t>. To zaručuje, že ani počas najhorúcejších letných dní, kedy sa povrch strechy extrémne prehrieva, asfalt netečie, nedeformuje sa a zachováva si svoju pružnosť.</w:t>
+        <w:t>Systém dopĺňa </w:t>
       </w:r>
       <w:r>
         <w:rPr>
@@ -1728,7 +1875,7 @@
           <w:sz w:val="28"/>
           <w:szCs w:val="24"/>
         </w:rPr>
-        <w:t xml:space="preserve"> </w:t>
+        <w:t>Bitu flex AL 4 STRIP</w:t>
       </w:r>
       <w:r>
         <w:rPr>
@@ -1737,7 +1884,7 @@
           <w:sz w:val="28"/>
           <w:szCs w:val="24"/>
         </w:rPr>
-        <w:t>Systém dopĺňa </w:t>
+        <w:t>, ktorý vďaka hliníkovej vložke funguje ako nepriepustná bariéra proti vlhkosti z interiéru a vďaka termostripom zabezpečuje bezpečné spojenie vrstie. Základom funkčnej strechy je podkladová vrstva </w:t>
       </w:r>
       <w:r>
         <w:rPr>
@@ -1748,9 +1895,17 @@
           <w:sz w:val="28"/>
           <w:szCs w:val="24"/>
         </w:rPr>
-        <w:t xml:space="preserve">Bitu </w:t>
-      </w:r>
-      <w:proofErr w:type="spellStart"/>
+        <w:t>Bitubase FIX PR 3 F</w:t>
+      </w:r>
+      <w:r>
+        <w:rPr>
+          <w:i/>
+          <w:iCs/>
+          <w:sz w:val="28"/>
+          <w:szCs w:val="24"/>
+        </w:rPr>
+        <w:t>. Táto technológia s tzv. </w:t>
+      </w:r>
       <w:r>
         <w:rPr>
           <w:b/>
@@ -1760,9 +1915,17 @@
           <w:sz w:val="28"/>
           <w:szCs w:val="24"/>
         </w:rPr>
-        <w:t>flex</w:t>
-      </w:r>
-      <w:proofErr w:type="spellEnd"/>
+        <w:t>expanznou funkciou</w:t>
+      </w:r>
+      <w:r>
+        <w:rPr>
+          <w:i/>
+          <w:iCs/>
+          <w:sz w:val="28"/>
+          <w:szCs w:val="24"/>
+        </w:rPr>
+        <w:t> využíva mikrokanáliky na spodnej strane, ktoré umožňujú streche "dýchať". Tým sa eliminuje najväčší nepriateľ plochých striech – vznik tlakových bublín spôsobených vlhkosťou uzatvorenou pod izoláciou. Použitie </w:t>
+      </w:r>
       <w:r>
         <w:rPr>
           <w:b/>
@@ -1772,7 +1935,7 @@
           <w:sz w:val="28"/>
           <w:szCs w:val="24"/>
         </w:rPr>
-        <w:t xml:space="preserve"> AL 4 STRIP</w:t>
+        <w:t>100 mm PIR izolácie (Inopan)</w:t>
       </w:r>
       <w:r>
         <w:rPr>
@@ -1781,227 +1944,70 @@
           <w:sz w:val="28"/>
           <w:szCs w:val="24"/>
         </w:rPr>
-        <w:t xml:space="preserve">, ktorý vďaka hliníkovej vložke funguje ako nepriepustná bariéra proti vlhkosti z interiéru a vďaka </w:t>
-      </w:r>
-      <w:proofErr w:type="spellStart"/>
-      <w:r>
+        <w:t> poskytuje pri minimálnej hrúbke maximálny tepelný odpor, čím chráni nosnú konštrukciu pred teplotnými šokmi a výrazne znižuje náklady na vykurovanie a chladenie. Práve preto vám vieme s čistým svedomím garantovať 10 rokov, hoci vieme, že táto strecha vydrží trojnásobne dlhšie.</w:t>
+      </w:r>
+    </w:p>
+    <w:p>
+      <w:pPr>
+        <w:jc w:val="center"/>
         <w:rPr>
           <w:i/>
           <w:iCs/>
           <w:sz w:val="28"/>
           <w:szCs w:val="24"/>
         </w:rPr>
-        <w:t>termostripom</w:t>
-      </w:r>
-      <w:proofErr w:type="spellEnd"/>
-      <w:r>
-        <w:rPr>
-          <w:i/>
-          <w:iCs/>
+      </w:pPr>
+    </w:p>
+    <w:p>
+      <w:pPr>
+        <w:rPr>
           <w:sz w:val="28"/>
           <w:szCs w:val="24"/>
         </w:rPr>
-        <w:t xml:space="preserve"> zabezpečuje bezpečné spojenie </w:t>
-      </w:r>
-      <w:proofErr w:type="spellStart"/>
-      <w:r>
-        <w:rPr>
-          <w:i/>
-          <w:iCs/>
+      </w:pPr>
+      <w:r>
+        <w:rPr>
           <w:sz w:val="28"/>
           <w:szCs w:val="24"/>
         </w:rPr>
-        <w:t>vrstie</w:t>
-      </w:r>
-      <w:proofErr w:type="spellEnd"/>
-      <w:r>
-        <w:rPr>
-          <w:i/>
-          <w:iCs/>
+        <w:t>Tešíme sa na našu ďalšiu spoluprácu.</w:t>
+      </w:r>
+    </w:p>
+    <w:p>
+      <w:pPr>
+        <w:rPr>
           <w:sz w:val="28"/>
           <w:szCs w:val="24"/>
         </w:rPr>
-        <w:t>. Základom funkčnej strechy je podkladová vrstva </w:t>
-      </w:r>
-      <w:proofErr w:type="spellStart"/>
-      <w:r>
-        <w:rPr>
-          <w:b/>
-          <w:bCs/>
-          <w:i/>
-          <w:iCs/>
+      </w:pPr>
+      <w:r>
+        <w:rPr>
           <w:sz w:val="28"/>
           <w:szCs w:val="24"/>
         </w:rPr>
-        <w:t>Bitubase</w:t>
-      </w:r>
-      <w:proofErr w:type="spellEnd"/>
-      <w:r>
-        <w:rPr>
-          <w:b/>
-          <w:bCs/>
-          <w:i/>
-          <w:iCs/>
+        <w:t>S pozdravom</w:t>
+      </w:r>
+    </w:p>
+    <w:p>
+      <w:pPr>
+        <w:tabs>
+          <w:tab w:val="left" w:pos="8340"/>
+        </w:tabs>
+        <w:jc w:val="right"/>
+        <w:rPr>
           <w:sz w:val="28"/>
           <w:szCs w:val="24"/>
         </w:rPr>
-        <w:t xml:space="preserve"> FIX PR 3 F</w:t>
-      </w:r>
-      <w:r>
-        <w:rPr>
-          <w:i/>
-          <w:iCs/>
+      </w:pPr>
+      <w:r>
+        <w:rPr>
           <w:sz w:val="28"/>
           <w:szCs w:val="24"/>
         </w:rPr>
-        <w:t>. Táto technológia s tzv. </w:t>
-      </w:r>
-      <w:r>
-        <w:rPr>
-          <w:b/>
-          <w:bCs/>
-          <w:i/>
-          <w:iCs/>
-          <w:sz w:val="28"/>
-          <w:szCs w:val="24"/>
-        </w:rPr>
-        <w:t>expanznou funkciou</w:t>
-      </w:r>
-      <w:r>
-        <w:rPr>
-          <w:i/>
-          <w:iCs/>
-          <w:sz w:val="28"/>
-          <w:szCs w:val="24"/>
-        </w:rPr>
-        <w:t xml:space="preserve"> využíva </w:t>
-      </w:r>
-      <w:proofErr w:type="spellStart"/>
-      <w:r>
-        <w:rPr>
-          <w:i/>
-          <w:iCs/>
-          <w:sz w:val="28"/>
-          <w:szCs w:val="24"/>
-        </w:rPr>
-        <w:t>mikrokanáliky</w:t>
-      </w:r>
-      <w:proofErr w:type="spellEnd"/>
-      <w:r>
-        <w:rPr>
-          <w:i/>
-          <w:iCs/>
-          <w:sz w:val="28"/>
-          <w:szCs w:val="24"/>
-        </w:rPr>
-        <w:t xml:space="preserve"> na spodnej strane, ktoré umožňujú streche "dýchať". Tým sa eliminuje najväčší nepriateľ plochých striech – vznik tlakových bublín spôsobených vlhkosťou uzatvorenou pod izoláciou. Použitie </w:t>
-      </w:r>
-      <w:r>
-        <w:rPr>
-          <w:b/>
-          <w:bCs/>
-          <w:i/>
-          <w:iCs/>
-          <w:sz w:val="28"/>
-          <w:szCs w:val="24"/>
-        </w:rPr>
-        <w:t>100 mm PIR izolácie (</w:t>
-      </w:r>
-      <w:proofErr w:type="spellStart"/>
-      <w:r>
-        <w:rPr>
-          <w:b/>
-          <w:bCs/>
-          <w:i/>
-          <w:iCs/>
-          <w:sz w:val="28"/>
-          <w:szCs w:val="24"/>
-        </w:rPr>
-        <w:t>Inopan</w:t>
-      </w:r>
-      <w:proofErr w:type="spellEnd"/>
-      <w:r>
-        <w:rPr>
-          <w:b/>
-          <w:bCs/>
-          <w:i/>
-          <w:iCs/>
-          <w:sz w:val="28"/>
-          <w:szCs w:val="24"/>
-        </w:rPr>
-        <w:t>)</w:t>
-      </w:r>
-      <w:r>
-        <w:rPr>
-          <w:i/>
-          <w:iCs/>
-          <w:sz w:val="28"/>
-          <w:szCs w:val="24"/>
-        </w:rPr>
-        <w:t> poskytuje pri minimálnej hrúbke maximálny tepelný odpor, čím chráni nosnú konštrukciu pred teplotnými šokmi a výrazne znižuje náklady na vykurovanie a chladenie. Práve preto vám vieme s čistým svedomím garantovať 10 rokov, hoci vieme, že táto strecha vydrží trojnásobne dlhšie.</w:t>
-      </w:r>
-    </w:p>
-    <w:p ns2:paraId="3B2988B3" ns2:textId="77777777">
-      <w:pPr>
-        <w:jc w:val="center"/>
-        <w:rPr>
-          <w:i/>
-          <w:iCs/>
-          <w:sz w:val="28"/>
-          <w:szCs w:val="24"/>
-        </w:rPr>
-      </w:pPr>
-    </w:p>
-    <w:p ns2:paraId="5CF4921D" ns2:textId="436E188A">
-      <w:pPr>
-        <w:rPr>
-          <w:sz w:val="28"/>
-          <w:szCs w:val="24"/>
-        </w:rPr>
-      </w:pPr>
-      <w:r>
-        <w:rPr>
-          <w:sz w:val="28"/>
-          <w:szCs w:val="24"/>
-        </w:rPr>
-        <w:t>Tešíme sa na našu ďalšiu spoluprácu.</w:t>
-      </w:r>
-    </w:p>
-    <w:p ns2:paraId="21E24FA9" ns2:textId="71B033FB">
-      <w:pPr>
-        <w:rPr>
-          <w:sz w:val="28"/>
-          <w:szCs w:val="24"/>
-        </w:rPr>
-      </w:pPr>
-      <w:r>
-        <w:rPr>
-          <w:sz w:val="28"/>
-          <w:szCs w:val="24"/>
-        </w:rPr>
-        <w:t>S pozdravom</w:t>
-      </w:r>
-    </w:p>
-    <w:p ns2:paraId="3F3E36A8" ns2:textId="4D8AAC9C">
-      <w:pPr>
-        <w:tabs>
-          <w:tab w:val="left" w:pos="8340"/>
-        </w:tabs>
-        <w:jc w:val="right"/>
-        <w:rPr>
-          <w:sz w:val="28"/>
-          <w:szCs w:val="24"/>
-        </w:rPr>
-      </w:pPr>
-      <w:r>
-        <w:rPr>
-          <w:sz w:val="28"/>
-          <w:szCs w:val="24"/>
-        </w:rPr>
         <w:t>Tomáš Solnoky</w:t>
       </w:r>
     </w:p>
-    <w:p ns2:paraId="6D867290" ns2:textId="32C5924D">
+    <w:p>
       <w:pPr>
         <w:tabs>
           <w:tab w:val="left" w:pos="8340"/>
@@ -2020,59 +2026,59 @@
           <w:sz w:val="36"/>
         </w:rPr>
         <w:drawing>
-          <ns3:anchor distT="0" distB="0" distL="114300" distR="114300" simplePos="0" relativeHeight="251696128" behindDoc="0" locked="0" layoutInCell="1" allowOverlap="1" ns4:anchorId="2C563608" ns4:editId="40A35A4E">
-            <ns3:simplePos x="0" y="0"/>
-            <ns3:positionH relativeFrom="margin">
-              <ns3:align>right</ns3:align>
-            </ns3:positionH>
-            <ns3:positionV relativeFrom="margin">
-              <ns3:posOffset>7931785</ns3:posOffset>
-            </ns3:positionV>
-            <ns3:extent cx="1379220" cy="1120140"/>
-            <ns3:effectExtent l="0" t="0" r="0" b="3810"/>
-            <ns3:wrapSquare wrapText="bothSides"/>
-            <ns3:docPr id="837538270" name="Obrázok 2" descr="Obrázok, na ktorom je text, písmo, logo, symbol&#10;&#10;Obsah vygenerovaný pomocou AI môže byť nesprávny."/>
-            <ns3:cNvGraphicFramePr>
-              <ns5:graphicFrameLocks noChangeAspect="1"/>
-            </ns3:cNvGraphicFramePr>
-            <ns5:graphic>
-              <ns5:graphicData uri="http://schemas.openxmlformats.org/drawingml/2006/picture">
-                <ns6:pic>
-                  <ns6:nvPicPr>
-                    <ns6:cNvPr id="471563147" name="Obrázok 2" descr="Obrázok, na ktorom je text, písmo, logo, symbol&#10;&#10;Obsah vygenerovaný pomocou AI môže byť nesprávny."/>
-                    <ns6:cNvPicPr/>
-                  </ns6:nvPicPr>
-                  <ns6:blipFill>
-                    <ns5:blip ns7:embed="rId21" cstate="print">
-                      <ns5:extLst>
-                        <ns5:ext uri="{28A0092B-C50C-407E-A947-70E740481C1C}">
-                          <ns8:useLocalDpi val="0"/>
-                        </ns5:ext>
-                      </ns5:extLst>
-                    </ns5:blip>
-                    <ns5:stretch>
-                      <ns5:fillRect/>
-                    </ns5:stretch>
-                  </ns6:blipFill>
-                  <ns6:spPr>
-                    <ns5:xfrm>
-                      <ns5:off x="0" y="0"/>
-                      <ns5:ext cx="1379220" cy="1120140"/>
-                    </ns5:xfrm>
-                    <ns5:prstGeom prst="rect">
-                      <ns5:avLst/>
-                    </ns5:prstGeom>
-                  </ns6:spPr>
-                </ns6:pic>
-              </ns5:graphicData>
-            </ns5:graphic>
-            <ns4:sizeRelH relativeFrom="margin">
-              <ns4:pctWidth>0</ns4:pctWidth>
-            </ns4:sizeRelH>
-            <ns4:sizeRelV relativeFrom="margin">
-              <ns4:pctHeight>0</ns4:pctHeight>
-            </ns4:sizeRelV>
-          </ns3:anchor>
+          <wp:anchor distT="0" distB="0" distL="114300" distR="114300" simplePos="0" relativeHeight="251696128" behindDoc="0" locked="0" layoutInCell="1" allowOverlap="1" wp14:anchorId="2C563608" wp14:editId="40A35A4E">
+            <wp:simplePos x="0" y="0"/>
+            <wp:positionH relativeFrom="margin">
+              <wp:align>right</wp:align>
+            </wp:positionH>
+            <wp:positionV relativeFrom="margin">
+              <wp:posOffset>7931785</wp:posOffset>
+            </wp:positionV>
+            <wp:extent cx="1379220" cy="1120140"/>
+            <wp:effectExtent l="0" t="0" r="0" b="3810"/>
+            <wp:wrapSquare wrapText="bothSides"/>
+            <wp:docPr id="837538270" name="Obrázok 2" descr="Obrázok, na ktorom je text, písmo, logo, symbol&#10;&#10;Obsah vygenerovaný pomocou AI môže byť nesprávny."/>
+            <wp:cNvGraphicFramePr>
+              <a:graphicFrameLocks xmlns:a="http://schemas.openxmlformats.org/drawingml/2006/main" noChangeAspect="1"/>
+            </wp:cNvGraphicFramePr>
+            <a:graphic xmlns:a="http://schemas.openxmlformats.org/drawingml/2006/main">
+              <a:graphicData uri="http://schemas.openxmlformats.org/drawingml/2006/picture">
+                <pic:pic xmlns:pic="http://schemas.openxmlformats.org/drawingml/2006/picture">
+                  <pic:nvPicPr>
+                    <pic:cNvPr id="471563147" name="Obrázok 2" descr="Obrázok, na ktorom je text, písmo, logo, symbol&#10;&#10;Obsah vygenerovaný pomocou AI môže byť nesprávny."/>
+                    <pic:cNvPicPr/>
+                  </pic:nvPicPr>
+                  <pic:blipFill>
+                    <a:blip r:embed="rId15" cstate="print">
+                      <a:extLst>
+                        <a:ext uri="{28A0092B-C50C-407E-A947-70E740481C1C}">
+                          <a14:useLocalDpi xmlns:a14="http://schemas.microsoft.com/office/drawing/2010/main" val="0"/>
+                        </a:ext>
+                      </a:extLst>
+                    </a:blip>
+                    <a:stretch>
+                      <a:fillRect/>
+                    </a:stretch>
+                  </pic:blipFill>
+                  <pic:spPr>
+                    <a:xfrm>
+                      <a:off x="0" y="0"/>
+                      <a:ext cx="1379220" cy="1120140"/>
+                    </a:xfrm>
+                    <a:prstGeom prst="rect">
+                      <a:avLst/>
+                    </a:prstGeom>
+                  </pic:spPr>
+                </pic:pic>
+              </a:graphicData>
+            </a:graphic>
+            <wp14:sizeRelH relativeFrom="margin">
+              <wp14:pctWidth>0</wp14:pctWidth>
+            </wp14:sizeRelH>
+            <wp14:sizeRelV relativeFrom="margin">
+              <wp14:pctHeight>0</wp14:pctHeight>
+            </wp14:sizeRelV>
+          </wp:anchor>
         </w:drawing>
       </w:r>
       <w:r>
@@ -2083,14 +2089,14 @@
         <w:t>Konateľ spoločnosti</w:t>
       </w:r>
     </w:p>
-    <w:p ns2:paraId="39BB09A3" ns2:textId="14AECBE0">
-      <w:pPr>
-        <w:rPr>
-          <w:sz w:val="24"/>
-        </w:rPr>
-      </w:pPr>
-    </w:p>
-    <w:p ns2:paraId="16353EE7" ns2:textId="576D762C">
+    <w:p>
+      <w:pPr>
+        <w:rPr>
+          <w:sz w:val="24"/>
+        </w:rPr>
+      </w:pPr>
+    </w:p>
+    <w:p>
       <w:pPr>
         <w:rPr>
           <w:sz w:val="24"/>
@@ -2110,7 +2116,7 @@
         <w:t>+421 911 551 354</w:t>
       </w:r>
     </w:p>
-    <w:p ns2:paraId="0839080B" ns2:textId="5893A248">
+    <w:p>
       <w:pPr>
         <w:rPr>
           <w:sz w:val="28"/>
@@ -2123,7 +2129,7 @@
         </w:rPr>
         <w:t xml:space="preserve">E-mail: </w:t>
       </w:r>
-      <w:hyperlink ns7:id="rId22" w:history="1">
+      <w:hyperlink r:id="rId16" w:history="1">
         <w:r>
           <w:rPr>
             <w:rStyle w:val="Hypertextovprepojenie"/>
@@ -2138,7 +2144,7 @@
         </w:rPr>
         <w:t xml:space="preserve"> / </w:t>
       </w:r>
-      <w:hyperlink ns7:id="rId23" w:history="1">
+      <w:hyperlink r:id="rId17" w:history="1">
         <w:r>
           <w:rPr>
             <w:rStyle w:val="Hypertextovprepojenie"/>
@@ -2163,8 +2169,8 @@
       </w:r>
     </w:p>
     <w:sectPr>
-      <w:headerReference w:type="default" ns7:id="rId24"/>
-      <w:footerReference w:type="default" ns7:id="rId25"/>
+      <w:headerReference w:type="default" r:id="rId18"/>
+      <w:footerReference w:type="default" r:id="rId19"/>
       <w:pgSz w:w="11906" w:h="16838"/>
       <w:pgMar w:top="1417" w:right="1417" w:bottom="1417" w:left="1417" w:header="708" w:footer="708" w:gutter="0"/>
       <w:cols w:space="708"/>

</xml_diff>

<commit_message>
Fix run-together material layers list in technical DOCX template
The skladba_vrstvy loop tags all sat inside a single Word paragraph, so
docxtemplater concatenated each material layer with no line break. Split
the loop across three paragraphs (start tag, item, end tag) the same way
the photo loop was structured, so paragraphLoop renders one layer per line.
Edited via Word COM automation to keep the OOXML valid.

Co-Authored-By: Claude Sonnet 5 <noreply@anthropic.com>
</commit_message>
<xml_diff>
--- a/inspections/templates/navrh-technickeho-riesenia.docx
+++ b/inspections/templates/navrh-technickeho-riesenia.docx
@@ -1001,7 +1001,33 @@
         <w:rPr>
           <w:sz w:val="24"/>
         </w:rPr>
-        <w:t>{#skladba_vrstvy}{polozka}{/skladba_vrstvy}</w:t>
+        <w:t>{#skladba_vrstvy}</w:t>
+      </w:r>
+    </w:p>
+    <w:p>
+      <w:pPr>
+        <w:rPr>
+          <w:sz w:val="24"/>
+        </w:rPr>
+      </w:pPr>
+      <w:r>
+        <w:rPr>
+          <w:sz w:val="24"/>
+        </w:rPr>
+        <w:t>{polozka}</w:t>
+      </w:r>
+    </w:p>
+    <w:p>
+      <w:pPr>
+        <w:rPr>
+          <w:sz w:val="24"/>
+        </w:rPr>
+      </w:pPr>
+      <w:r>
+        <w:rPr>
+          <w:sz w:val="24"/>
+        </w:rPr>
+        <w:t>{/skladba_vrstvy}</w:t>
       </w:r>
     </w:p>
     <w:p>
@@ -1406,7 +1432,7 @@
           <w:szCs w:val="28"/>
         </w:rPr>
         <w:drawing>
-          <wp:anchor distT="0" distB="0" distL="114300" distR="114300" simplePos="0" relativeHeight="251679743" behindDoc="0" locked="0" layoutInCell="1" allowOverlap="1" wp14:anchorId="351A1939" wp14:editId="15F2A3C8">
+          <wp:anchor distT="0" distB="0" distL="114300" distR="114300" simplePos="0" relativeHeight="251679743" behindDoc="0" locked="0" layoutInCell="1" allowOverlap="1" wp14:anchorId="351A1939" wp14:editId="0BD85254">
             <wp:simplePos x="0" y="0"/>
             <wp:positionH relativeFrom="margin">
               <wp:align>center</wp:align>

</xml_diff>

<commit_message>
Structure the Technicke riesenie value field and feed it into the DOCX
Replace the free-text "Hodnota" field on checked checklist items with a
number paired with the catalog item's own unit (m2/ks/vlastna, chosen
once when the item is added to the catalog) instead of asking for a unit
again per inspection.

Wire checked items into generate-technical-document.ts and add a matching
loop section to templates/navrh-technickeho-riesenia.docx ("Technicke
opatrenia") — previously the generated document ignored the checklist
entirely, driven only by the static MaterialComposition. Edited the
template's raw XML directly (no LibreOffice/pandoc available in this
environment) and verified the exact production renderer (docxtemplater)
against the modified file before and after generating a real document
through the deployed API.

Co-Authored-By: Claude Sonnet 5 <noreply@anthropic.com>
</commit_message>
<xml_diff>
--- a/inspections/templates/navrh-technickeho-riesenia.docx
+++ b/inspections/templates/navrh-technickeho-riesenia.docx
@@ -1094,6 +1094,73 @@
         </w:rPr>
         <w:t>{postup_prac}</w:t>
       </w:r>
+    </w:p>
+    <w:p>
+      <w:pPr>
+        <w:rPr>
+          <w:b/>
+          <w:color w:val="EE0000"/>
+          <w:sz w:val="28"/>
+          <w:u w:val="single"/>
+        </w:rPr>
+      </w:pPr>
+      <w:r>
+        <w:rPr>
+          <w:b/>
+          <w:color w:val="EE0000"/>
+          <w:sz w:val="28"/>
+          <w:highlight w:val="yellow"/>
+          <w:u w:val="single"/>
+        </w:rPr>
+        <w:t>Technické opatrenia :</w:t>
+      </w:r>
+    </w:p>
+    <w:p>
+      <w:pPr>
+        <w:rPr>
+          <w:sz w:val="24"/>
+        </w:rPr>
+      </w:pPr>
+      <w:r>
+        <w:rPr>
+          <w:sz w:val="24"/>
+        </w:rPr>
+        <w:t>{#technicke_opatrenia}</w:t>
+      </w:r>
+    </w:p>
+    <w:p>
+      <w:pPr>
+        <w:rPr>
+          <w:sz w:val="24"/>
+        </w:rPr>
+      </w:pPr>
+      <w:r>
+        <w:rPr>
+          <w:sz w:val="24"/>
+        </w:rPr>
+        <w:t>{riadok}</w:t>
+      </w:r>
+    </w:p>
+    <w:p>
+      <w:pPr>
+        <w:rPr>
+          <w:sz w:val="24"/>
+        </w:rPr>
+      </w:pPr>
+      <w:r>
+        <w:rPr>
+          <w:sz w:val="24"/>
+        </w:rPr>
+        <w:t>{/technicke_opatrenia}</w:t>
+      </w:r>
+    </w:p>
+    <w:p>
+      <w:pPr>
+        <w:rPr>
+          <w:b/>
+          <w:sz w:val="24"/>
+        </w:rPr>
+      </w:pPr>
     </w:p>
     <w:p>
       <w:pPr>

</xml_diff>